<commit_message>
18 Apr | Footage Check
since the shoot started, footage were being checked and compiled as a draft.
</commit_message>
<xml_diff>
--- a/DMP Report.docx
+++ b/DMP Report.docx
@@ -36,7 +36,7 @@
                     <pic:cNvPicPr preferRelativeResize="0"/>
                   </pic:nvPicPr>
                   <pic:blipFill>
-                    <a:blip r:embed="rId7"/>
+                    <a:blip r:embed="rId8"/>
                     <a:srcRect/>
                     <a:stretch>
                       <a:fillRect/>
@@ -88,7 +88,7 @@
                     <pic:cNvPicPr preferRelativeResize="0"/>
                   </pic:nvPicPr>
                   <pic:blipFill>
-                    <a:blip r:embed="rId8"/>
+                    <a:blip r:embed="rId9"/>
                     <a:srcRect/>
                     <a:stretch>
                       <a:fillRect/>
@@ -464,6 +464,7 @@
     <w:p>
       <w:pPr>
         <w:pStyle w:val="Title"/>
+        <w:spacing w:before="60"/>
         <w:rPr>
           <w:sz w:val="36"/>
           <w:szCs w:val="36"/>
@@ -479,6 +480,9 @@
       </w:r>
     </w:p>
     <w:p>
+      <w:pPr>
+        <w:spacing w:before="60" w:after="0"/>
+      </w:pPr>
       <w:r>
         <w:rPr>
           <w:i/>
@@ -490,96 +494,102 @@
         <w:br w:type="page"/>
       </w:r>
     </w:p>
-    <w:p/>
-    <w:p>
-      <w:pPr>
-        <w:keepNext/>
-        <w:keepLines/>
-        <w:pBdr>
-          <w:top w:val="nil"/>
-          <w:left w:val="nil"/>
-          <w:bottom w:val="nil"/>
-          <w:right w:val="nil"/>
-          <w:between w:val="nil"/>
-        </w:pBdr>
-        <w:spacing w:before="240" w:after="0"/>
-        <w:ind w:left="432" w:hanging="432"/>
-        <w:rPr>
-          <w:b/>
-          <w:color w:val="000000"/>
-          <w:sz w:val="28"/>
-          <w:szCs w:val="28"/>
-        </w:rPr>
-      </w:pPr>
-      <w:r>
-        <w:rPr>
-          <w:b/>
-          <w:color w:val="000000"/>
-          <w:sz w:val="28"/>
-          <w:szCs w:val="28"/>
-        </w:rPr>
-        <w:t>Contents</w:t>
-      </w:r>
-    </w:p>
     <w:sdt>
       <w:sdtPr>
-        <w:id w:val="-318805861"/>
+        <w:id w:val="-1763753867"/>
         <w:docPartObj>
           <w:docPartGallery w:val="Table of Contents"/>
           <w:docPartUnique/>
         </w:docPartObj>
       </w:sdtPr>
+      <w:sdtEndPr>
+        <w:rPr>
+          <w:rFonts w:ascii="Arial" w:eastAsia="Arial" w:hAnsi="Arial" w:cs="Arial"/>
+          <w:noProof/>
+          <w:color w:val="auto"/>
+          <w:sz w:val="24"/>
+          <w:szCs w:val="24"/>
+          <w:lang w:val="en-GB"/>
+        </w:rPr>
+      </w:sdtEndPr>
       <w:sdtContent>
+        <w:p>
+          <w:pPr>
+            <w:pStyle w:val="TOCHeading"/>
+            <w:rPr>
+              <w:rFonts w:ascii="Arial" w:hAnsi="Arial" w:cs="Arial"/>
+            </w:rPr>
+          </w:pPr>
+          <w:r>
+            <w:rPr>
+              <w:rFonts w:ascii="Arial" w:hAnsi="Arial" w:cs="Arial"/>
+            </w:rPr>
+            <w:t>Table of Contents</w:t>
+          </w:r>
+        </w:p>
         <w:p>
           <w:pPr>
             <w:pStyle w:val="TOC1"/>
             <w:tabs>
-              <w:tab w:val="left" w:pos="480"/>
-              <w:tab w:val="right" w:pos="9350"/>
+              <w:tab w:val="right" w:leader="dot" w:pos="9350"/>
             </w:tabs>
             <w:rPr>
+              <w:rFonts w:eastAsiaTheme="minorEastAsia" w:cstheme="minorBidi"/>
+              <w:b w:val="0"/>
+              <w:bCs w:val="0"/>
+              <w:i w:val="0"/>
+              <w:iCs w:val="0"/>
               <w:noProof/>
+              <w:kern w:val="2"/>
+              <w:lang w:val="en-NP"/>
+              <w14:ligatures w14:val="standardContextual"/>
             </w:rPr>
           </w:pPr>
           <w:r>
+            <w:rPr>
+              <w:rFonts w:ascii="Arial" w:hAnsi="Arial"/>
+              <w:b w:val="0"/>
+              <w:bCs w:val="0"/>
+              <w:i w:val="0"/>
+              <w:iCs w:val="0"/>
+            </w:rPr>
             <w:fldChar w:fldCharType="begin"/>
           </w:r>
           <w:r>
-            <w:instrText xml:space="preserve"> TOC \h \u \z \t "Heading 1,1,Heading 2,2,Heading 3,3,Heading 4,4,Heading 5,5,Heading 6,6,"</w:instrText>
+            <w:rPr>
+              <w:rFonts w:ascii="Arial" w:hAnsi="Arial"/>
+              <w:i w:val="0"/>
+              <w:iCs w:val="0"/>
+            </w:rPr>
+            <w:instrText xml:space="preserve"> TOC \o "1-3" \h \z \u </w:instrText>
           </w:r>
           <w:r>
+            <w:rPr>
+              <w:rFonts w:ascii="Arial" w:hAnsi="Arial"/>
+              <w:b w:val="0"/>
+              <w:bCs w:val="0"/>
+              <w:i w:val="0"/>
+              <w:iCs w:val="0"/>
+            </w:rPr>
             <w:fldChar w:fldCharType="separate"/>
           </w:r>
-          <w:hyperlink w:anchor="_Toc227246550" w:history="1">
+          <w:hyperlink w:anchor="_Toc227352496" w:history="1">
             <w:r>
               <w:rPr>
                 <w:rStyle w:val="Hyperlink"/>
                 <w:noProof/>
               </w:rPr>
-              <w:t>1.</w:t>
-            </w:r>
-            <w:r>
-              <w:rPr>
-                <w:noProof/>
+              <w:t>1. Introduction</w:t>
+            </w:r>
+            <w:r>
+              <w:rPr>
+                <w:noProof/>
+                <w:webHidden/>
               </w:rPr>
               <w:tab/>
             </w:r>
             <w:r>
               <w:rPr>
-                <w:rStyle w:val="Hyperlink"/>
-                <w:noProof/>
-              </w:rPr>
-              <w:t>Introduction</w:t>
-            </w:r>
-            <w:r>
-              <w:rPr>
-                <w:noProof/>
-                <w:webHidden/>
-              </w:rPr>
-              <w:tab/>
-            </w:r>
-            <w:r>
-              <w:rPr>
                 <w:noProof/>
                 <w:webHidden/>
               </w:rPr>
@@ -590,7 +600,7 @@
                 <w:noProof/>
                 <w:webHidden/>
               </w:rPr>
-              <w:instrText xml:space="preserve"> PAGEREF _Toc227246550 \h </w:instrText>
+              <w:instrText xml:space="preserve"> PAGEREF _Toc227352496 \h </w:instrText>
             </w:r>
             <w:r>
               <w:rPr>
@@ -610,7 +620,7 @@
                 <w:noProof/>
                 <w:webHidden/>
               </w:rPr>
-              <w:t>1</w:t>
+              <w:t>4</w:t>
             </w:r>
             <w:r>
               <w:rPr>
@@ -625,43 +635,37 @@
           <w:pPr>
             <w:pStyle w:val="TOC2"/>
             <w:tabs>
-              <w:tab w:val="left" w:pos="960"/>
-              <w:tab w:val="right" w:pos="9350"/>
+              <w:tab w:val="right" w:leader="dot" w:pos="9350"/>
             </w:tabs>
             <w:rPr>
+              <w:rFonts w:eastAsiaTheme="minorEastAsia" w:cstheme="minorBidi"/>
+              <w:b w:val="0"/>
+              <w:bCs w:val="0"/>
               <w:noProof/>
+              <w:kern w:val="2"/>
+              <w:sz w:val="24"/>
+              <w:szCs w:val="24"/>
+              <w:lang w:val="en-NP"/>
+              <w14:ligatures w14:val="standardContextual"/>
             </w:rPr>
           </w:pPr>
-          <w:hyperlink w:anchor="_Toc227246551" w:history="1">
+          <w:hyperlink w:anchor="_Toc227352497" w:history="1">
             <w:r>
               <w:rPr>
                 <w:rStyle w:val="Hyperlink"/>
                 <w:noProof/>
               </w:rPr>
-              <w:t>1.1</w:t>
-            </w:r>
-            <w:r>
-              <w:rPr>
-                <w:noProof/>
+              <w:t>1.1 Topic</w:t>
+            </w:r>
+            <w:r>
+              <w:rPr>
+                <w:noProof/>
+                <w:webHidden/>
               </w:rPr>
               <w:tab/>
             </w:r>
             <w:r>
               <w:rPr>
-                <w:rStyle w:val="Hyperlink"/>
-                <w:noProof/>
-              </w:rPr>
-              <w:t>Topic</w:t>
-            </w:r>
-            <w:r>
-              <w:rPr>
-                <w:noProof/>
-                <w:webHidden/>
-              </w:rPr>
-              <w:tab/>
-            </w:r>
-            <w:r>
-              <w:rPr>
                 <w:noProof/>
                 <w:webHidden/>
               </w:rPr>
@@ -672,7 +676,7 @@
                 <w:noProof/>
                 <w:webHidden/>
               </w:rPr>
-              <w:instrText xml:space="preserve"> PAGEREF _Toc227246551 \h </w:instrText>
+              <w:instrText xml:space="preserve"> PAGEREF _Toc227352497 \h </w:instrText>
             </w:r>
             <w:r>
               <w:rPr>
@@ -692,7 +696,7 @@
                 <w:noProof/>
                 <w:webHidden/>
               </w:rPr>
-              <w:t>1</w:t>
+              <w:t>4</w:t>
             </w:r>
             <w:r>
               <w:rPr>
@@ -707,43 +711,37 @@
           <w:pPr>
             <w:pStyle w:val="TOC2"/>
             <w:tabs>
-              <w:tab w:val="left" w:pos="960"/>
-              <w:tab w:val="right" w:pos="9350"/>
+              <w:tab w:val="right" w:leader="dot" w:pos="9350"/>
             </w:tabs>
             <w:rPr>
+              <w:rFonts w:eastAsiaTheme="minorEastAsia" w:cstheme="minorBidi"/>
+              <w:b w:val="0"/>
+              <w:bCs w:val="0"/>
               <w:noProof/>
+              <w:kern w:val="2"/>
+              <w:sz w:val="24"/>
+              <w:szCs w:val="24"/>
+              <w:lang w:val="en-NP"/>
+              <w14:ligatures w14:val="standardContextual"/>
             </w:rPr>
           </w:pPr>
-          <w:hyperlink w:anchor="_Toc227246552" w:history="1">
+          <w:hyperlink w:anchor="_Toc227352498" w:history="1">
             <w:r>
               <w:rPr>
                 <w:rStyle w:val="Hyperlink"/>
                 <w:noProof/>
               </w:rPr>
-              <w:t>1.2</w:t>
-            </w:r>
-            <w:r>
-              <w:rPr>
-                <w:noProof/>
+              <w:t>1.2 Area of Research</w:t>
+            </w:r>
+            <w:r>
+              <w:rPr>
+                <w:noProof/>
+                <w:webHidden/>
               </w:rPr>
               <w:tab/>
             </w:r>
             <w:r>
               <w:rPr>
-                <w:rStyle w:val="Hyperlink"/>
-                <w:noProof/>
-              </w:rPr>
-              <w:t>Area of Research</w:t>
-            </w:r>
-            <w:r>
-              <w:rPr>
-                <w:noProof/>
-                <w:webHidden/>
-              </w:rPr>
-              <w:tab/>
-            </w:r>
-            <w:r>
-              <w:rPr>
                 <w:noProof/>
                 <w:webHidden/>
               </w:rPr>
@@ -754,7 +752,7 @@
                 <w:noProof/>
                 <w:webHidden/>
               </w:rPr>
-              <w:instrText xml:space="preserve"> PAGEREF _Toc227246552 \h </w:instrText>
+              <w:instrText xml:space="preserve"> PAGEREF _Toc227352498 \h </w:instrText>
             </w:r>
             <w:r>
               <w:rPr>
@@ -774,7 +772,7 @@
                 <w:noProof/>
                 <w:webHidden/>
               </w:rPr>
-              <w:t>1</w:t>
+              <w:t>4</w:t>
             </w:r>
             <w:r>
               <w:rPr>
@@ -789,43 +787,37 @@
           <w:pPr>
             <w:pStyle w:val="TOC1"/>
             <w:tabs>
-              <w:tab w:val="left" w:pos="480"/>
-              <w:tab w:val="right" w:pos="9350"/>
+              <w:tab w:val="right" w:leader="dot" w:pos="9350"/>
             </w:tabs>
             <w:rPr>
+              <w:rFonts w:eastAsiaTheme="minorEastAsia" w:cstheme="minorBidi"/>
+              <w:b w:val="0"/>
+              <w:bCs w:val="0"/>
+              <w:i w:val="0"/>
+              <w:iCs w:val="0"/>
               <w:noProof/>
+              <w:kern w:val="2"/>
+              <w:lang w:val="en-NP"/>
+              <w14:ligatures w14:val="standardContextual"/>
             </w:rPr>
           </w:pPr>
-          <w:hyperlink w:anchor="_Toc227246553" w:history="1">
+          <w:hyperlink w:anchor="_Toc227352499" w:history="1">
             <w:r>
               <w:rPr>
                 <w:rStyle w:val="Hyperlink"/>
                 <w:noProof/>
               </w:rPr>
-              <w:t>2</w:t>
-            </w:r>
-            <w:r>
-              <w:rPr>
-                <w:noProof/>
+              <w:t>2. Aims of Project</w:t>
+            </w:r>
+            <w:r>
+              <w:rPr>
+                <w:noProof/>
+                <w:webHidden/>
               </w:rPr>
               <w:tab/>
             </w:r>
             <w:r>
               <w:rPr>
-                <w:rStyle w:val="Hyperlink"/>
-                <w:noProof/>
-              </w:rPr>
-              <w:t>Aims of Project</w:t>
-            </w:r>
-            <w:r>
-              <w:rPr>
-                <w:noProof/>
-                <w:webHidden/>
-              </w:rPr>
-              <w:tab/>
-            </w:r>
-            <w:r>
-              <w:rPr>
                 <w:noProof/>
                 <w:webHidden/>
               </w:rPr>
@@ -836,7 +828,7 @@
                 <w:noProof/>
                 <w:webHidden/>
               </w:rPr>
-              <w:instrText xml:space="preserve"> PAGEREF _Toc227246553 \h </w:instrText>
+              <w:instrText xml:space="preserve"> PAGEREF _Toc227352499 \h </w:instrText>
             </w:r>
             <w:r>
               <w:rPr>
@@ -856,7 +848,7 @@
                 <w:noProof/>
                 <w:webHidden/>
               </w:rPr>
-              <w:t>2</w:t>
+              <w:t>5</w:t>
             </w:r>
             <w:r>
               <w:rPr>
@@ -871,43 +863,37 @@
           <w:pPr>
             <w:pStyle w:val="TOC1"/>
             <w:tabs>
-              <w:tab w:val="left" w:pos="480"/>
-              <w:tab w:val="right" w:pos="9350"/>
+              <w:tab w:val="right" w:leader="dot" w:pos="9350"/>
             </w:tabs>
             <w:rPr>
+              <w:rFonts w:eastAsiaTheme="minorEastAsia" w:cstheme="minorBidi"/>
+              <w:b w:val="0"/>
+              <w:bCs w:val="0"/>
+              <w:i w:val="0"/>
+              <w:iCs w:val="0"/>
               <w:noProof/>
+              <w:kern w:val="2"/>
+              <w:lang w:val="en-NP"/>
+              <w14:ligatures w14:val="standardContextual"/>
             </w:rPr>
           </w:pPr>
-          <w:hyperlink w:anchor="_Toc227246554" w:history="1">
+          <w:hyperlink w:anchor="_Toc227352500" w:history="1">
             <w:r>
               <w:rPr>
                 <w:rStyle w:val="Hyperlink"/>
                 <w:noProof/>
               </w:rPr>
-              <w:t>3</w:t>
-            </w:r>
-            <w:r>
-              <w:rPr>
-                <w:noProof/>
+              <w:t>3. Target Audience</w:t>
+            </w:r>
+            <w:r>
+              <w:rPr>
+                <w:noProof/>
+                <w:webHidden/>
               </w:rPr>
               <w:tab/>
             </w:r>
             <w:r>
               <w:rPr>
-                <w:rStyle w:val="Hyperlink"/>
-                <w:noProof/>
-              </w:rPr>
-              <w:t>Target Audience</w:t>
-            </w:r>
-            <w:r>
-              <w:rPr>
-                <w:noProof/>
-                <w:webHidden/>
-              </w:rPr>
-              <w:tab/>
-            </w:r>
-            <w:r>
-              <w:rPr>
                 <w:noProof/>
                 <w:webHidden/>
               </w:rPr>
@@ -918,7 +904,7 @@
                 <w:noProof/>
                 <w:webHidden/>
               </w:rPr>
-              <w:instrText xml:space="preserve"> PAGEREF _Toc227246554 \h </w:instrText>
+              <w:instrText xml:space="preserve"> PAGEREF _Toc227352500 \h </w:instrText>
             </w:r>
             <w:r>
               <w:rPr>
@@ -938,7 +924,7 @@
                 <w:noProof/>
                 <w:webHidden/>
               </w:rPr>
-              <w:t>3</w:t>
+              <w:t>6</w:t>
             </w:r>
             <w:r>
               <w:rPr>
@@ -953,43 +939,37 @@
           <w:pPr>
             <w:pStyle w:val="TOC1"/>
             <w:tabs>
-              <w:tab w:val="left" w:pos="480"/>
-              <w:tab w:val="right" w:pos="9350"/>
+              <w:tab w:val="right" w:leader="dot" w:pos="9350"/>
             </w:tabs>
             <w:rPr>
+              <w:rFonts w:eastAsiaTheme="minorEastAsia" w:cstheme="minorBidi"/>
+              <w:b w:val="0"/>
+              <w:bCs w:val="0"/>
+              <w:i w:val="0"/>
+              <w:iCs w:val="0"/>
               <w:noProof/>
+              <w:kern w:val="2"/>
+              <w:lang w:val="en-NP"/>
+              <w14:ligatures w14:val="standardContextual"/>
             </w:rPr>
           </w:pPr>
-          <w:hyperlink w:anchor="_Toc227246555" w:history="1">
+          <w:hyperlink w:anchor="_Toc227352501" w:history="1">
             <w:r>
               <w:rPr>
                 <w:rStyle w:val="Hyperlink"/>
                 <w:noProof/>
               </w:rPr>
-              <w:t>4</w:t>
-            </w:r>
-            <w:r>
-              <w:rPr>
-                <w:noProof/>
+              <w:t>5. Technologies Employed</w:t>
+            </w:r>
+            <w:r>
+              <w:rPr>
+                <w:noProof/>
+                <w:webHidden/>
               </w:rPr>
               <w:tab/>
             </w:r>
             <w:r>
               <w:rPr>
-                <w:rStyle w:val="Hyperlink"/>
-                <w:noProof/>
-              </w:rPr>
-              <w:t>Product Research</w:t>
-            </w:r>
-            <w:r>
-              <w:rPr>
-                <w:noProof/>
-                <w:webHidden/>
-              </w:rPr>
-              <w:tab/>
-            </w:r>
-            <w:r>
-              <w:rPr>
                 <w:noProof/>
                 <w:webHidden/>
               </w:rPr>
@@ -1000,7 +980,7 @@
                 <w:noProof/>
                 <w:webHidden/>
               </w:rPr>
-              <w:instrText xml:space="preserve"> PAGEREF _Toc227246555 \h </w:instrText>
+              <w:instrText xml:space="preserve"> PAGEREF _Toc227352501 \h </w:instrText>
             </w:r>
             <w:r>
               <w:rPr>
@@ -1020,7 +1000,7 @@
                 <w:noProof/>
                 <w:webHidden/>
               </w:rPr>
-              <w:t>4</w:t>
+              <w:t>8</w:t>
             </w:r>
             <w:r>
               <w:rPr>
@@ -1035,43 +1015,37 @@
           <w:pPr>
             <w:pStyle w:val="TOC1"/>
             <w:tabs>
-              <w:tab w:val="left" w:pos="480"/>
-              <w:tab w:val="right" w:pos="9350"/>
+              <w:tab w:val="right" w:leader="dot" w:pos="9350"/>
             </w:tabs>
             <w:rPr>
+              <w:rFonts w:eastAsiaTheme="minorEastAsia" w:cstheme="minorBidi"/>
+              <w:b w:val="0"/>
+              <w:bCs w:val="0"/>
+              <w:i w:val="0"/>
+              <w:iCs w:val="0"/>
               <w:noProof/>
+              <w:kern w:val="2"/>
+              <w:lang w:val="en-NP"/>
+              <w14:ligatures w14:val="standardContextual"/>
             </w:rPr>
           </w:pPr>
-          <w:hyperlink w:anchor="_Toc227246556" w:history="1">
+          <w:hyperlink w:anchor="_Toc227352502" w:history="1">
             <w:r>
               <w:rPr>
                 <w:rStyle w:val="Hyperlink"/>
                 <w:noProof/>
               </w:rPr>
-              <w:t>5</w:t>
-            </w:r>
-            <w:r>
-              <w:rPr>
-                <w:noProof/>
+              <w:t>6. Target Audience</w:t>
+            </w:r>
+            <w:r>
+              <w:rPr>
+                <w:noProof/>
+                <w:webHidden/>
               </w:rPr>
               <w:tab/>
             </w:r>
             <w:r>
               <w:rPr>
-                <w:rStyle w:val="Hyperlink"/>
-                <w:noProof/>
-              </w:rPr>
-              <w:t>Technologies Employed</w:t>
-            </w:r>
-            <w:r>
-              <w:rPr>
-                <w:noProof/>
-                <w:webHidden/>
-              </w:rPr>
-              <w:tab/>
-            </w:r>
-            <w:r>
-              <w:rPr>
                 <w:noProof/>
                 <w:webHidden/>
               </w:rPr>
@@ -1082,7 +1056,7 @@
                 <w:noProof/>
                 <w:webHidden/>
               </w:rPr>
-              <w:instrText xml:space="preserve"> PAGEREF _Toc227246556 \h </w:instrText>
+              <w:instrText xml:space="preserve"> PAGEREF _Toc227352502 \h </w:instrText>
             </w:r>
             <w:r>
               <w:rPr>
@@ -1102,7 +1076,7 @@
                 <w:noProof/>
                 <w:webHidden/>
               </w:rPr>
-              <w:t>5</w:t>
+              <w:t>9</w:t>
             </w:r>
             <w:r>
               <w:rPr>
@@ -1117,33 +1091,103 @@
           <w:pPr>
             <w:pStyle w:val="TOC1"/>
             <w:tabs>
-              <w:tab w:val="left" w:pos="480"/>
-              <w:tab w:val="right" w:pos="9350"/>
+              <w:tab w:val="right" w:leader="dot" w:pos="9350"/>
             </w:tabs>
             <w:rPr>
+              <w:rFonts w:eastAsiaTheme="minorEastAsia" w:cstheme="minorBidi"/>
+              <w:b w:val="0"/>
+              <w:bCs w:val="0"/>
+              <w:i w:val="0"/>
+              <w:iCs w:val="0"/>
               <w:noProof/>
+              <w:kern w:val="2"/>
+              <w:lang w:val="en-NP"/>
+              <w14:ligatures w14:val="standardContextual"/>
             </w:rPr>
           </w:pPr>
-          <w:hyperlink w:anchor="_Toc227246557" w:history="1">
+          <w:hyperlink w:anchor="_Toc227352503" w:history="1">
             <w:r>
               <w:rPr>
                 <w:rStyle w:val="Hyperlink"/>
                 <w:noProof/>
               </w:rPr>
-              <w:t>6</w:t>
-            </w:r>
-            <w:r>
-              <w:rPr>
-                <w:noProof/>
+              <w:t>7. Production Phases</w:t>
+            </w:r>
+            <w:r>
+              <w:rPr>
+                <w:noProof/>
+                <w:webHidden/>
               </w:rPr>
               <w:tab/>
             </w:r>
             <w:r>
               <w:rPr>
+                <w:noProof/>
+                <w:webHidden/>
+              </w:rPr>
+              <w:fldChar w:fldCharType="begin"/>
+            </w:r>
+            <w:r>
+              <w:rPr>
+                <w:noProof/>
+                <w:webHidden/>
+              </w:rPr>
+              <w:instrText xml:space="preserve"> PAGEREF _Toc227352503 \h </w:instrText>
+            </w:r>
+            <w:r>
+              <w:rPr>
+                <w:noProof/>
+                <w:webHidden/>
+              </w:rPr>
+            </w:r>
+            <w:r>
+              <w:rPr>
+                <w:noProof/>
+                <w:webHidden/>
+              </w:rPr>
+              <w:fldChar w:fldCharType="separate"/>
+            </w:r>
+            <w:r>
+              <w:rPr>
+                <w:noProof/>
+                <w:webHidden/>
+              </w:rPr>
+              <w:t>10</w:t>
+            </w:r>
+            <w:r>
+              <w:rPr>
+                <w:noProof/>
+                <w:webHidden/>
+              </w:rPr>
+              <w:fldChar w:fldCharType="end"/>
+            </w:r>
+          </w:hyperlink>
+        </w:p>
+        <w:p>
+          <w:pPr>
+            <w:pStyle w:val="TOC2"/>
+            <w:tabs>
+              <w:tab w:val="right" w:leader="dot" w:pos="9350"/>
+            </w:tabs>
+            <w:rPr>
+              <w:rFonts w:eastAsiaTheme="minorEastAsia" w:cstheme="minorBidi"/>
+              <w:b w:val="0"/>
+              <w:bCs w:val="0"/>
+              <w:noProof/>
+              <w:kern w:val="2"/>
+              <w:sz w:val="24"/>
+              <w:szCs w:val="24"/>
+              <w:lang w:val="en-NP"/>
+              <w14:ligatures w14:val="standardContextual"/>
+            </w:rPr>
+          </w:pPr>
+          <w:hyperlink w:anchor="_Toc227352504" w:history="1">
+            <w:r>
+              <w:rPr>
                 <w:rStyle w:val="Hyperlink"/>
                 <w:noProof/>
               </w:rPr>
-              <w:t>Project Plan</w:t>
+              <w:t>7.1 Pre-production</w:t>
             </w:r>
             <w:r>
               <w:rPr>
@@ -1164,7 +1208,7 @@
                 <w:noProof/>
                 <w:webHidden/>
               </w:rPr>
-              <w:instrText xml:space="preserve"> PAGEREF _Toc227246557 \h </w:instrText>
+              <w:instrText xml:space="preserve"> PAGEREF _Toc227352504 \h </w:instrText>
             </w:r>
             <w:r>
               <w:rPr>
@@ -1184,7 +1228,159 @@
                 <w:noProof/>
                 <w:webHidden/>
               </w:rPr>
-              <w:t>6</w:t>
+              <w:t>10</w:t>
+            </w:r>
+            <w:r>
+              <w:rPr>
+                <w:noProof/>
+                <w:webHidden/>
+              </w:rPr>
+              <w:fldChar w:fldCharType="end"/>
+            </w:r>
+          </w:hyperlink>
+        </w:p>
+        <w:p>
+          <w:pPr>
+            <w:pStyle w:val="TOC2"/>
+            <w:tabs>
+              <w:tab w:val="right" w:leader="dot" w:pos="9350"/>
+            </w:tabs>
+            <w:rPr>
+              <w:rFonts w:eastAsiaTheme="minorEastAsia" w:cstheme="minorBidi"/>
+              <w:b w:val="0"/>
+              <w:bCs w:val="0"/>
+              <w:noProof/>
+              <w:kern w:val="2"/>
+              <w:sz w:val="24"/>
+              <w:szCs w:val="24"/>
+              <w:lang w:val="en-NP"/>
+              <w14:ligatures w14:val="standardContextual"/>
+            </w:rPr>
+          </w:pPr>
+          <w:hyperlink w:anchor="_Toc227352505" w:history="1">
+            <w:r>
+              <w:rPr>
+                <w:rStyle w:val="Hyperlink"/>
+                <w:noProof/>
+              </w:rPr>
+              <w:t>7.2 Production</w:t>
+            </w:r>
+            <w:r>
+              <w:rPr>
+                <w:noProof/>
+                <w:webHidden/>
+              </w:rPr>
+              <w:tab/>
+            </w:r>
+            <w:r>
+              <w:rPr>
+                <w:noProof/>
+                <w:webHidden/>
+              </w:rPr>
+              <w:fldChar w:fldCharType="begin"/>
+            </w:r>
+            <w:r>
+              <w:rPr>
+                <w:noProof/>
+                <w:webHidden/>
+              </w:rPr>
+              <w:instrText xml:space="preserve"> PAGEREF _Toc227352505 \h </w:instrText>
+            </w:r>
+            <w:r>
+              <w:rPr>
+                <w:noProof/>
+                <w:webHidden/>
+              </w:rPr>
+            </w:r>
+            <w:r>
+              <w:rPr>
+                <w:noProof/>
+                <w:webHidden/>
+              </w:rPr>
+              <w:fldChar w:fldCharType="separate"/>
+            </w:r>
+            <w:r>
+              <w:rPr>
+                <w:noProof/>
+                <w:webHidden/>
+              </w:rPr>
+              <w:t>10</w:t>
+            </w:r>
+            <w:r>
+              <w:rPr>
+                <w:noProof/>
+                <w:webHidden/>
+              </w:rPr>
+              <w:fldChar w:fldCharType="end"/>
+            </w:r>
+          </w:hyperlink>
+        </w:p>
+        <w:p>
+          <w:pPr>
+            <w:pStyle w:val="TOC2"/>
+            <w:tabs>
+              <w:tab w:val="right" w:leader="dot" w:pos="9350"/>
+            </w:tabs>
+            <w:rPr>
+              <w:rFonts w:eastAsiaTheme="minorEastAsia" w:cstheme="minorBidi"/>
+              <w:b w:val="0"/>
+              <w:bCs w:val="0"/>
+              <w:noProof/>
+              <w:kern w:val="2"/>
+              <w:sz w:val="24"/>
+              <w:szCs w:val="24"/>
+              <w:lang w:val="en-NP"/>
+              <w14:ligatures w14:val="standardContextual"/>
+            </w:rPr>
+          </w:pPr>
+          <w:hyperlink w:anchor="_Toc227352506" w:history="1">
+            <w:r>
+              <w:rPr>
+                <w:rStyle w:val="Hyperlink"/>
+                <w:noProof/>
+              </w:rPr>
+              <w:t>7.3 Post-production</w:t>
+            </w:r>
+            <w:r>
+              <w:rPr>
+                <w:noProof/>
+                <w:webHidden/>
+              </w:rPr>
+              <w:tab/>
+            </w:r>
+            <w:r>
+              <w:rPr>
+                <w:noProof/>
+                <w:webHidden/>
+              </w:rPr>
+              <w:fldChar w:fldCharType="begin"/>
+            </w:r>
+            <w:r>
+              <w:rPr>
+                <w:noProof/>
+                <w:webHidden/>
+              </w:rPr>
+              <w:instrText xml:space="preserve"> PAGEREF _Toc227352506 \h </w:instrText>
+            </w:r>
+            <w:r>
+              <w:rPr>
+                <w:noProof/>
+                <w:webHidden/>
+              </w:rPr>
+            </w:r>
+            <w:r>
+              <w:rPr>
+                <w:noProof/>
+                <w:webHidden/>
+              </w:rPr>
+              <w:fldChar w:fldCharType="separate"/>
+            </w:r>
+            <w:r>
+              <w:rPr>
+                <w:noProof/>
+                <w:webHidden/>
+              </w:rPr>
+              <w:t>10</w:t>
             </w:r>
             <w:r>
               <w:rPr>
@@ -1199,43 +1395,37 @@
           <w:pPr>
             <w:pStyle w:val="TOC1"/>
             <w:tabs>
-              <w:tab w:val="left" w:pos="480"/>
-              <w:tab w:val="right" w:pos="9350"/>
+              <w:tab w:val="right" w:leader="dot" w:pos="9350"/>
             </w:tabs>
             <w:rPr>
+              <w:rFonts w:eastAsiaTheme="minorEastAsia" w:cstheme="minorBidi"/>
+              <w:b w:val="0"/>
+              <w:bCs w:val="0"/>
+              <w:i w:val="0"/>
+              <w:iCs w:val="0"/>
               <w:noProof/>
+              <w:kern w:val="2"/>
+              <w:lang w:val="en-NP"/>
+              <w14:ligatures w14:val="standardContextual"/>
             </w:rPr>
           </w:pPr>
-          <w:hyperlink w:anchor="_Toc227246558" w:history="1">
+          <w:hyperlink w:anchor="_Toc227352507" w:history="1">
             <w:r>
               <w:rPr>
                 <w:rStyle w:val="Hyperlink"/>
                 <w:noProof/>
               </w:rPr>
-              <w:t>7</w:t>
-            </w:r>
-            <w:r>
-              <w:rPr>
-                <w:noProof/>
+              <w:t>8. Resources</w:t>
+            </w:r>
+            <w:r>
+              <w:rPr>
+                <w:noProof/>
+                <w:webHidden/>
               </w:rPr>
               <w:tab/>
             </w:r>
             <w:r>
               <w:rPr>
-                <w:rStyle w:val="Hyperlink"/>
-                <w:noProof/>
-              </w:rPr>
-              <w:t>Production Phases</w:t>
-            </w:r>
-            <w:r>
-              <w:rPr>
-                <w:noProof/>
-                <w:webHidden/>
-              </w:rPr>
-              <w:tab/>
-            </w:r>
-            <w:r>
-              <w:rPr>
                 <w:noProof/>
                 <w:webHidden/>
               </w:rPr>
@@ -1246,7 +1436,7 @@
                 <w:noProof/>
                 <w:webHidden/>
               </w:rPr>
-              <w:instrText xml:space="preserve"> PAGEREF _Toc227246558 \h </w:instrText>
+              <w:instrText xml:space="preserve"> PAGEREF _Toc227352507 \h </w:instrText>
             </w:r>
             <w:r>
               <w:rPr>
@@ -1266,7 +1456,7 @@
                 <w:noProof/>
                 <w:webHidden/>
               </w:rPr>
-              <w:t>7</w:t>
+              <w:t>11</w:t>
             </w:r>
             <w:r>
               <w:rPr>
@@ -1281,43 +1471,37 @@
           <w:pPr>
             <w:pStyle w:val="TOC1"/>
             <w:tabs>
-              <w:tab w:val="left" w:pos="480"/>
-              <w:tab w:val="right" w:pos="9350"/>
+              <w:tab w:val="right" w:leader="dot" w:pos="9350"/>
             </w:tabs>
             <w:rPr>
+              <w:rFonts w:eastAsiaTheme="minorEastAsia" w:cstheme="minorBidi"/>
+              <w:b w:val="0"/>
+              <w:bCs w:val="0"/>
+              <w:i w:val="0"/>
+              <w:iCs w:val="0"/>
               <w:noProof/>
+              <w:kern w:val="2"/>
+              <w:lang w:val="en-NP"/>
+              <w14:ligatures w14:val="standardContextual"/>
             </w:rPr>
           </w:pPr>
-          <w:hyperlink w:anchor="_Toc227246559" w:history="1">
+          <w:hyperlink w:anchor="_Toc227352508" w:history="1">
             <w:r>
               <w:rPr>
                 <w:rStyle w:val="Hyperlink"/>
                 <w:noProof/>
               </w:rPr>
-              <w:t>8</w:t>
-            </w:r>
-            <w:r>
-              <w:rPr>
-                <w:noProof/>
+              <w:t>9. User Testing &amp; Findings</w:t>
+            </w:r>
+            <w:r>
+              <w:rPr>
+                <w:noProof/>
+                <w:webHidden/>
               </w:rPr>
               <w:tab/>
             </w:r>
             <w:r>
               <w:rPr>
-                <w:rStyle w:val="Hyperlink"/>
-                <w:noProof/>
-              </w:rPr>
-              <w:t>Resources</w:t>
-            </w:r>
-            <w:r>
-              <w:rPr>
-                <w:noProof/>
-                <w:webHidden/>
-              </w:rPr>
-              <w:tab/>
-            </w:r>
-            <w:r>
-              <w:rPr>
                 <w:noProof/>
                 <w:webHidden/>
               </w:rPr>
@@ -1328,7 +1512,7 @@
                 <w:noProof/>
                 <w:webHidden/>
               </w:rPr>
-              <w:instrText xml:space="preserve"> PAGEREF _Toc227246559 \h </w:instrText>
+              <w:instrText xml:space="preserve"> PAGEREF _Toc227352508 \h </w:instrText>
             </w:r>
             <w:r>
               <w:rPr>
@@ -1348,7 +1532,7 @@
                 <w:noProof/>
                 <w:webHidden/>
               </w:rPr>
-              <w:t>8</w:t>
+              <w:t>12</w:t>
             </w:r>
             <w:r>
               <w:rPr>
@@ -1363,43 +1547,37 @@
           <w:pPr>
             <w:pStyle w:val="TOC1"/>
             <w:tabs>
-              <w:tab w:val="left" w:pos="480"/>
-              <w:tab w:val="right" w:pos="9350"/>
+              <w:tab w:val="right" w:leader="dot" w:pos="9350"/>
             </w:tabs>
             <w:rPr>
+              <w:rFonts w:eastAsiaTheme="minorEastAsia" w:cstheme="minorBidi"/>
+              <w:b w:val="0"/>
+              <w:bCs w:val="0"/>
+              <w:i w:val="0"/>
+              <w:iCs w:val="0"/>
               <w:noProof/>
+              <w:kern w:val="2"/>
+              <w:lang w:val="en-NP"/>
+              <w14:ligatures w14:val="standardContextual"/>
             </w:rPr>
           </w:pPr>
-          <w:hyperlink w:anchor="_Toc227246560" w:history="1">
+          <w:hyperlink w:anchor="_Toc227352509" w:history="1">
             <w:r>
               <w:rPr>
                 <w:rStyle w:val="Hyperlink"/>
                 <w:noProof/>
               </w:rPr>
-              <w:t>9</w:t>
-            </w:r>
-            <w:r>
-              <w:rPr>
-                <w:noProof/>
+              <w:t>10. Conclusion</w:t>
+            </w:r>
+            <w:r>
+              <w:rPr>
+                <w:noProof/>
+                <w:webHidden/>
               </w:rPr>
               <w:tab/>
             </w:r>
             <w:r>
               <w:rPr>
-                <w:rStyle w:val="Hyperlink"/>
-                <w:noProof/>
-              </w:rPr>
-              <w:t>User Testing &amp; Findings</w:t>
-            </w:r>
-            <w:r>
-              <w:rPr>
-                <w:noProof/>
-                <w:webHidden/>
-              </w:rPr>
-              <w:tab/>
-            </w:r>
-            <w:r>
-              <w:rPr>
                 <w:noProof/>
                 <w:webHidden/>
               </w:rPr>
@@ -1410,7 +1588,7 @@
                 <w:noProof/>
                 <w:webHidden/>
               </w:rPr>
-              <w:instrText xml:space="preserve"> PAGEREF _Toc227246560 \h </w:instrText>
+              <w:instrText xml:space="preserve"> PAGEREF _Toc227352509 \h </w:instrText>
             </w:r>
             <w:r>
               <w:rPr>
@@ -1430,7 +1608,7 @@
                 <w:noProof/>
                 <w:webHidden/>
               </w:rPr>
-              <w:t>9</w:t>
+              <w:t>13</w:t>
             </w:r>
             <w:r>
               <w:rPr>
@@ -1445,43 +1623,37 @@
           <w:pPr>
             <w:pStyle w:val="TOC1"/>
             <w:tabs>
-              <w:tab w:val="left" w:pos="720"/>
-              <w:tab w:val="right" w:pos="9350"/>
+              <w:tab w:val="right" w:leader="dot" w:pos="9350"/>
             </w:tabs>
             <w:rPr>
+              <w:rFonts w:eastAsiaTheme="minorEastAsia" w:cstheme="minorBidi"/>
+              <w:b w:val="0"/>
+              <w:bCs w:val="0"/>
+              <w:i w:val="0"/>
+              <w:iCs w:val="0"/>
               <w:noProof/>
+              <w:kern w:val="2"/>
+              <w:lang w:val="en-NP"/>
+              <w14:ligatures w14:val="standardContextual"/>
             </w:rPr>
           </w:pPr>
-          <w:hyperlink w:anchor="_Toc227246561" w:history="1">
+          <w:hyperlink w:anchor="_Toc227352510" w:history="1">
             <w:r>
               <w:rPr>
                 <w:rStyle w:val="Hyperlink"/>
                 <w:noProof/>
               </w:rPr>
-              <w:t>10</w:t>
-            </w:r>
-            <w:r>
-              <w:rPr>
-                <w:noProof/>
+              <w:t>11. References</w:t>
+            </w:r>
+            <w:r>
+              <w:rPr>
+                <w:noProof/>
+                <w:webHidden/>
               </w:rPr>
               <w:tab/>
             </w:r>
             <w:r>
               <w:rPr>
-                <w:rStyle w:val="Hyperlink"/>
-                <w:noProof/>
-              </w:rPr>
-              <w:t>Conclusion</w:t>
-            </w:r>
-            <w:r>
-              <w:rPr>
-                <w:noProof/>
-                <w:webHidden/>
-              </w:rPr>
-              <w:tab/>
-            </w:r>
-            <w:r>
-              <w:rPr>
                 <w:noProof/>
                 <w:webHidden/>
               </w:rPr>
@@ -1492,7 +1664,7 @@
                 <w:noProof/>
                 <w:webHidden/>
               </w:rPr>
-              <w:instrText xml:space="preserve"> PAGEREF _Toc227246561 \h </w:instrText>
+              <w:instrText xml:space="preserve"> PAGEREF _Toc227352510 \h </w:instrText>
             </w:r>
             <w:r>
               <w:rPr>
@@ -1512,7 +1684,7 @@
                 <w:noProof/>
                 <w:webHidden/>
               </w:rPr>
-              <w:t>10</w:t>
+              <w:t>14</w:t>
             </w:r>
             <w:r>
               <w:rPr>
@@ -1527,43 +1699,37 @@
           <w:pPr>
             <w:pStyle w:val="TOC1"/>
             <w:tabs>
-              <w:tab w:val="left" w:pos="720"/>
-              <w:tab w:val="right" w:pos="9350"/>
+              <w:tab w:val="right" w:leader="dot" w:pos="9350"/>
             </w:tabs>
             <w:rPr>
+              <w:rFonts w:eastAsiaTheme="minorEastAsia" w:cstheme="minorBidi"/>
+              <w:b w:val="0"/>
+              <w:bCs w:val="0"/>
+              <w:i w:val="0"/>
+              <w:iCs w:val="0"/>
               <w:noProof/>
+              <w:kern w:val="2"/>
+              <w:lang w:val="en-NP"/>
+              <w14:ligatures w14:val="standardContextual"/>
             </w:rPr>
           </w:pPr>
-          <w:hyperlink w:anchor="_Toc227246562" w:history="1">
+          <w:hyperlink w:anchor="_Toc227352511" w:history="1">
             <w:r>
               <w:rPr>
                 <w:rStyle w:val="Hyperlink"/>
                 <w:noProof/>
               </w:rPr>
-              <w:t>11</w:t>
-            </w:r>
-            <w:r>
-              <w:rPr>
-                <w:noProof/>
+              <w:t>12. Bibliography</w:t>
+            </w:r>
+            <w:r>
+              <w:rPr>
+                <w:noProof/>
+                <w:webHidden/>
               </w:rPr>
               <w:tab/>
             </w:r>
             <w:r>
               <w:rPr>
-                <w:rStyle w:val="Hyperlink"/>
-                <w:noProof/>
-              </w:rPr>
-              <w:t>References</w:t>
-            </w:r>
-            <w:r>
-              <w:rPr>
-                <w:noProof/>
-                <w:webHidden/>
-              </w:rPr>
-              <w:tab/>
-            </w:r>
-            <w:r>
-              <w:rPr>
                 <w:noProof/>
                 <w:webHidden/>
               </w:rPr>
@@ -1574,7 +1740,7 @@
                 <w:noProof/>
                 <w:webHidden/>
               </w:rPr>
-              <w:instrText xml:space="preserve"> PAGEREF _Toc227246562 \h </w:instrText>
+              <w:instrText xml:space="preserve"> PAGEREF _Toc227352511 \h </w:instrText>
             </w:r>
             <w:r>
               <w:rPr>
@@ -1594,7 +1760,7 @@
                 <w:noProof/>
                 <w:webHidden/>
               </w:rPr>
-              <w:t>11</w:t>
+              <w:t>15</w:t>
             </w:r>
             <w:r>
               <w:rPr>
@@ -1609,43 +1775,37 @@
           <w:pPr>
             <w:pStyle w:val="TOC1"/>
             <w:tabs>
-              <w:tab w:val="left" w:pos="720"/>
-              <w:tab w:val="right" w:pos="9350"/>
+              <w:tab w:val="right" w:leader="dot" w:pos="9350"/>
             </w:tabs>
             <w:rPr>
+              <w:rFonts w:eastAsiaTheme="minorEastAsia" w:cstheme="minorBidi"/>
+              <w:b w:val="0"/>
+              <w:bCs w:val="0"/>
+              <w:i w:val="0"/>
+              <w:iCs w:val="0"/>
               <w:noProof/>
+              <w:kern w:val="2"/>
+              <w:lang w:val="en-NP"/>
+              <w14:ligatures w14:val="standardContextual"/>
             </w:rPr>
           </w:pPr>
-          <w:hyperlink w:anchor="_Toc227246563" w:history="1">
+          <w:hyperlink w:anchor="_Toc227352512" w:history="1">
             <w:r>
               <w:rPr>
                 <w:rStyle w:val="Hyperlink"/>
                 <w:noProof/>
               </w:rPr>
-              <w:t>12</w:t>
-            </w:r>
-            <w:r>
-              <w:rPr>
-                <w:noProof/>
+              <w:t>13. Appendix</w:t>
+            </w:r>
+            <w:r>
+              <w:rPr>
+                <w:noProof/>
+                <w:webHidden/>
               </w:rPr>
               <w:tab/>
             </w:r>
             <w:r>
               <w:rPr>
-                <w:rStyle w:val="Hyperlink"/>
-                <w:noProof/>
-              </w:rPr>
-              <w:t>Bibliography</w:t>
-            </w:r>
-            <w:r>
-              <w:rPr>
-                <w:noProof/>
-                <w:webHidden/>
-              </w:rPr>
-              <w:tab/>
-            </w:r>
-            <w:r>
-              <w:rPr>
                 <w:noProof/>
                 <w:webHidden/>
               </w:rPr>
@@ -1656,7 +1816,7 @@
                 <w:noProof/>
                 <w:webHidden/>
               </w:rPr>
-              <w:instrText xml:space="preserve"> PAGEREF _Toc227246563 \h </w:instrText>
+              <w:instrText xml:space="preserve"> PAGEREF _Toc227352512 \h </w:instrText>
             </w:r>
             <w:r>
               <w:rPr>
@@ -1676,89 +1836,7 @@
                 <w:noProof/>
                 <w:webHidden/>
               </w:rPr>
-              <w:t>12</w:t>
-            </w:r>
-            <w:r>
-              <w:rPr>
-                <w:noProof/>
-                <w:webHidden/>
-              </w:rPr>
-              <w:fldChar w:fldCharType="end"/>
-            </w:r>
-          </w:hyperlink>
-        </w:p>
-        <w:p>
-          <w:pPr>
-            <w:pStyle w:val="TOC1"/>
-            <w:tabs>
-              <w:tab w:val="left" w:pos="720"/>
-              <w:tab w:val="right" w:pos="9350"/>
-            </w:tabs>
-            <w:rPr>
-              <w:noProof/>
-            </w:rPr>
-          </w:pPr>
-          <w:hyperlink w:anchor="_Toc227246564" w:history="1">
-            <w:r>
-              <w:rPr>
-                <w:rStyle w:val="Hyperlink"/>
-                <w:noProof/>
-              </w:rPr>
-              <w:t>13</w:t>
-            </w:r>
-            <w:r>
-              <w:rPr>
-                <w:noProof/>
-              </w:rPr>
-              <w:tab/>
-            </w:r>
-            <w:r>
-              <w:rPr>
-                <w:rStyle w:val="Hyperlink"/>
-                <w:noProof/>
-              </w:rPr>
-              <w:t>Appendix</w:t>
-            </w:r>
-            <w:r>
-              <w:rPr>
-                <w:noProof/>
-                <w:webHidden/>
-              </w:rPr>
-              <w:tab/>
-            </w:r>
-            <w:r>
-              <w:rPr>
-                <w:noProof/>
-                <w:webHidden/>
-              </w:rPr>
-              <w:fldChar w:fldCharType="begin"/>
-            </w:r>
-            <w:r>
-              <w:rPr>
-                <w:noProof/>
-                <w:webHidden/>
-              </w:rPr>
-              <w:instrText xml:space="preserve"> PAGEREF _Toc227246564 \h </w:instrText>
-            </w:r>
-            <w:r>
-              <w:rPr>
-                <w:noProof/>
-                <w:webHidden/>
-              </w:rPr>
-            </w:r>
-            <w:r>
-              <w:rPr>
-                <w:noProof/>
-                <w:webHidden/>
-              </w:rPr>
-              <w:fldChar w:fldCharType="separate"/>
-            </w:r>
-            <w:r>
-              <w:rPr>
-                <w:noProof/>
-                <w:webHidden/>
-              </w:rPr>
-              <w:t>13</w:t>
+              <w:t>16</w:t>
             </w:r>
             <w:r>
               <w:rPr>
@@ -1771,6 +1849,11 @@
         </w:p>
         <w:p>
           <w:r>
+            <w:rPr>
+              <w:b/>
+              <w:bCs/>
+              <w:noProof/>
+            </w:rPr>
             <w:fldChar w:fldCharType="end"/>
           </w:r>
         </w:p>
@@ -1778,94 +1861,205 @@
     </w:sdt>
     <w:p>
       <w:pPr>
+        <w:spacing w:before="60" w:after="0"/>
+      </w:pPr>
+    </w:p>
+    <w:p>
+      <w:pPr>
+        <w:rPr>
+          <w:b/>
+          <w:color w:val="000000"/>
+          <w:sz w:val="32"/>
+          <w:szCs w:val="28"/>
+        </w:rPr>
+      </w:pPr>
+      <w:bookmarkStart w:id="1" w:name="_Toc218022811"/>
+      <w:r>
+        <w:br w:type="page"/>
+      </w:r>
+    </w:p>
+    <w:p>
+      <w:pPr>
         <w:pStyle w:val="Heading1"/>
-        <w:ind w:left="7452"/>
-        <w:sectPr>
-          <w:footerReference w:type="even" r:id="rId9"/>
-          <w:pgSz w:w="12240" w:h="15840"/>
-          <w:pgMar w:top="1440" w:right="1440" w:bottom="1440" w:left="1440" w:header="720" w:footer="720" w:gutter="0"/>
-          <w:pgNumType w:start="1"/>
-          <w:cols w:space="720"/>
-        </w:sectPr>
-      </w:pPr>
-    </w:p>
-    <w:p>
-      <w:pPr>
-        <w:pStyle w:val="Heading1"/>
-        <w:numPr>
-          <w:ilvl w:val="0"/>
-          <w:numId w:val="3"/>
-        </w:numPr>
-      </w:pPr>
-      <w:bookmarkStart w:id="1" w:name="_Toc227246550"/>
+        <w:spacing w:before="0" w:after="120"/>
+      </w:pPr>
+      <w:bookmarkStart w:id="2" w:name="_Toc227352496"/>
       <w:r>
         <w:lastRenderedPageBreak/>
-        <w:t>Introduction</w:t>
+        <w:t>1. Introduction</w:t>
       </w:r>
       <w:bookmarkEnd w:id="1"/>
+      <w:bookmarkEnd w:id="2"/>
     </w:p>
     <w:p>
       <w:pPr>
         <w:pStyle w:val="Heading2"/>
-        <w:numPr>
-          <w:ilvl w:val="1"/>
-          <w:numId w:val="1"/>
-        </w:numPr>
-      </w:pPr>
-      <w:bookmarkStart w:id="2" w:name="_Toc227246551"/>
+        <w:spacing w:before="120"/>
+      </w:pPr>
+      <w:bookmarkStart w:id="3" w:name="_Toc227352497"/>
+      <w:r>
+        <w:t>1.1</w:t>
+      </w:r>
+      <w:r>
+        <w:t xml:space="preserve"> </w:t>
+      </w:r>
       <w:r>
         <w:t>Topic</w:t>
       </w:r>
-      <w:bookmarkEnd w:id="2"/>
-    </w:p>
-    <w:p>
-      <w:pPr>
-        <w:ind w:firstLine="576"/>
-        <w:rPr>
-          <w:i/>
-          <w:color w:val="808080"/>
-        </w:rPr>
-      </w:pPr>
-      <w:r>
-        <w:rPr>
-          <w:i/>
-          <w:color w:val="808080"/>
-        </w:rPr>
-        <w:t>Mention the project topic here and give a brief description about it.</w:t>
+      <w:bookmarkEnd w:id="3"/>
+    </w:p>
+    <w:p>
+      <w:pPr>
+        <w:spacing w:before="60" w:after="158"/>
+      </w:pPr>
+      <w:r>
+        <w:t xml:space="preserve">The project is all about creating a Product Shoot Television Commercial (TVC) for an insulated water bottle from the MBT brand. </w:t>
+      </w:r>
+      <w:proofErr w:type="gramStart"/>
+      <w:r>
+        <w:t>This commercial aims</w:t>
+      </w:r>
+      <w:proofErr w:type="gramEnd"/>
+      <w:r>
+        <w:t xml:space="preserve"> to showcase the bottle’s standout features, like its eco-friendly design, portability, built-in straw, and a variety of colo</w:t>
+      </w:r>
+      <w:r>
+        <w:t>u</w:t>
+      </w:r>
+      <w:r>
+        <w:t>r options. The goal is to present the product not just as a practical item, but as a stylish accessory that fits seamlessly into everyday life</w:t>
+      </w:r>
+      <w:r>
+        <w:t xml:space="preserve">, </w:t>
+      </w:r>
+      <w:r>
+        <w:t xml:space="preserve">whether you’re </w:t>
+      </w:r>
+      <w:r>
+        <w:t>going</w:t>
+      </w:r>
+      <w:r>
+        <w:t xml:space="preserve"> the gym, working at the office, or enjoying outdoor adventures like hiking.</w:t>
+      </w:r>
+    </w:p>
+    <w:p>
+      <w:pPr>
+        <w:spacing w:before="60" w:after="60"/>
+      </w:pPr>
+      <w:r>
+        <w:t xml:space="preserve">The TVC will blend different visual styles, mixing high-energy, fast-paced sequences with slower, more relaxed moments to keep viewers engaged. </w:t>
+      </w:r>
+      <w:r>
+        <w:t>Its</w:t>
+      </w:r>
+      <w:r>
+        <w:t xml:space="preserve"> length is </w:t>
+      </w:r>
+      <w:r>
+        <w:t>about 50 to 60 seconds and will primarily target digital platforms like YouTube and Instagram, where eye-catching, short-form content thrives. By featuring the product in various real-life situations, the project aims to highlight its versatility and practicality while ensuring a polished and visually appealing presentation.</w:t>
       </w:r>
     </w:p>
     <w:p>
       <w:pPr>
         <w:pStyle w:val="Heading2"/>
-        <w:numPr>
-          <w:ilvl w:val="1"/>
-          <w:numId w:val="1"/>
-        </w:numPr>
-      </w:pPr>
-      <w:bookmarkStart w:id="3" w:name="_Toc227246552"/>
+      </w:pPr>
+      <w:bookmarkStart w:id="4" w:name="_Toc227352498"/>
+      <w:r>
+        <w:t>1</w:t>
+      </w:r>
+      <w:r>
+        <w:t>.</w:t>
+      </w:r>
+      <w:r>
+        <w:t>2</w:t>
+      </w:r>
+      <w:r>
+        <w:t xml:space="preserve"> </w:t>
+      </w:r>
       <w:r>
         <w:t>Area of Research</w:t>
       </w:r>
-      <w:bookmarkEnd w:id="3"/>
-    </w:p>
-    <w:p>
-      <w:pPr>
-        <w:ind w:left="576"/>
-        <w:rPr>
-          <w:i/>
-          <w:color w:val="808080"/>
-        </w:rPr>
-      </w:pPr>
-      <w:r>
-        <w:rPr>
-          <w:i/>
-          <w:color w:val="808080"/>
-        </w:rPr>
-        <w:t>Mention the main research topic here what were research upon before concluding what was required for the final outcome.</w:t>
-      </w:r>
-    </w:p>
-    <w:p>
-      <w:pPr>
+      <w:bookmarkEnd w:id="4"/>
+    </w:p>
+    <w:p>
+      <w:pPr>
+        <w:spacing w:after="158"/>
+      </w:pPr>
+      <w:r>
+        <w:t xml:space="preserve">The journey of this project was </w:t>
+      </w:r>
+      <w:r>
+        <w:t>supported</w:t>
+      </w:r>
+      <w:r>
+        <w:t xml:space="preserve"> by in-depth research into essential aspects of digital media production and product advertising. </w:t>
+      </w:r>
+      <w:r>
+        <w:t>C</w:t>
+      </w:r>
+      <w:r>
+        <w:t xml:space="preserve">inematography techniques, exploring camera movement, framing, and shot composition </w:t>
+      </w:r>
+      <w:r>
+        <w:t xml:space="preserve">were researched </w:t>
+      </w:r>
+      <w:r>
+        <w:t xml:space="preserve">to effectively showcase product details and craft visually </w:t>
+      </w:r>
+      <w:r>
+        <w:t>appealing</w:t>
+      </w:r>
+      <w:r>
+        <w:t xml:space="preserve"> sequences.</w:t>
+      </w:r>
+      <w:r>
+        <w:t xml:space="preserve"> V</w:t>
+      </w:r>
+      <w:r>
+        <w:t xml:space="preserve">arious lighting techniques </w:t>
+      </w:r>
+      <w:r>
+        <w:t xml:space="preserve">were also examined </w:t>
+      </w:r>
+      <w:r>
+        <w:t>to see how different setups can enhance a product's look and set the overall mood of the commercial.</w:t>
+      </w:r>
+      <w:r>
+        <w:t xml:space="preserve"> </w:t>
+      </w:r>
+    </w:p>
+    <w:p>
+      <w:r>
+        <w:t>On top of that, editing techniques, focusing on cuts, pacing, and transitions</w:t>
+      </w:r>
+      <w:r>
+        <w:t xml:space="preserve"> were also researched</w:t>
+      </w:r>
+      <w:r>
+        <w:t xml:space="preserve"> to keep a lively flow that fits short-form advertising perfectly. Sound design played a crucial role too, as how audio mixing, music, and sound effects can elevate the viewing experience</w:t>
+      </w:r>
+      <w:r>
+        <w:t xml:space="preserve"> were also </w:t>
+      </w:r>
+      <w:r>
+        <w:t>researched</w:t>
+      </w:r>
+      <w:r>
+        <w:t>.</w:t>
+      </w:r>
+      <w:r>
+        <w:t xml:space="preserve"> Additionally, product-based commercials to grasp how visual storytelling and real-life usage scenarios can effectively convey product value and brand identity</w:t>
+      </w:r>
+      <w:r>
+        <w:t xml:space="preserve"> were analysed</w:t>
+      </w:r>
+      <w:r>
+        <w:t>. All these research areas came together to guide the creative and technical choices made throughout the project.</w:t>
+      </w:r>
+    </w:p>
+    <w:p>
+      <w:pPr>
+        <w:spacing w:before="60" w:after="0"/>
         <w:rPr>
           <w:b/>
           <w:color w:val="000000"/>
@@ -1880,21 +2074,129 @@
     <w:p>
       <w:pPr>
         <w:pStyle w:val="Heading1"/>
-        <w:numPr>
-          <w:ilvl w:val="0"/>
-          <w:numId w:val="1"/>
-        </w:numPr>
-      </w:pPr>
-      <w:bookmarkStart w:id="4" w:name="_Toc227246553"/>
+      </w:pPr>
+      <w:bookmarkStart w:id="5" w:name="_Toc227352499"/>
       <w:r>
         <w:lastRenderedPageBreak/>
+        <w:t>2</w:t>
+      </w:r>
+      <w:r>
+        <w:t xml:space="preserve">. </w:t>
+      </w:r>
+      <w:r>
         <w:t>Aims of Project</w:t>
       </w:r>
-      <w:bookmarkEnd w:id="4"/>
-    </w:p>
-    <w:p>
-      <w:pPr>
-        <w:ind w:left="432"/>
+      <w:bookmarkEnd w:id="5"/>
+    </w:p>
+    <w:p>
+      <w:r>
+        <w:t>The main goal of this project is to craft a visually captivating and professional Product Shoot TVC that truly highlights the MBT</w:t>
+      </w:r>
+      <w:r>
+        <w:t xml:space="preserve">’s </w:t>
+      </w:r>
+      <w:r>
+        <w:t xml:space="preserve">insulated bottle. </w:t>
+      </w:r>
+      <w:r>
+        <w:t>The TVC will</w:t>
+      </w:r>
+      <w:r>
+        <w:t xml:space="preserve"> be made to </w:t>
+      </w:r>
+      <w:r>
+        <w:t>showcase the product’s functionality, portability, and how it fits into everyday life through some creative cinematography and editing techniques.</w:t>
+      </w:r>
+    </w:p>
+    <w:p>
+      <w:r>
+        <w:t>Another important objective is to utilize industry-standard production methods, like camera movement, lighting, editing, and sound design, to create a top-notch commercial</w:t>
+      </w:r>
+      <w:r>
+        <w:t>. To</w:t>
+      </w:r>
+      <w:r>
+        <w:t xml:space="preserve"> illustrate the product’s </w:t>
+      </w:r>
+      <w:r>
+        <w:t xml:space="preserve">versatility, it has been used </w:t>
+      </w:r>
+      <w:r>
+        <w:t>in various real-life situations, making it relatable for our target audience.</w:t>
+      </w:r>
+    </w:p>
+    <w:p>
+      <w:pPr>
+        <w:rPr>
+          <w:color w:val="000000"/>
+          <w:sz w:val="28"/>
+          <w:szCs w:val="28"/>
+        </w:rPr>
+      </w:pPr>
+      <w:r>
+        <w:br w:type="page"/>
+      </w:r>
+    </w:p>
+    <w:p>
+      <w:pPr>
+        <w:pStyle w:val="Heading1"/>
+      </w:pPr>
+      <w:bookmarkStart w:id="6" w:name="_Toc227352500"/>
+      <w:r>
+        <w:lastRenderedPageBreak/>
+        <w:t>3</w:t>
+      </w:r>
+      <w:r>
+        <w:t xml:space="preserve">. </w:t>
+      </w:r>
+      <w:r>
+        <w:t>Target Audience</w:t>
+      </w:r>
+      <w:bookmarkEnd w:id="6"/>
+    </w:p>
+    <w:p>
+      <w:r>
+        <w:t xml:space="preserve">The target audience for this Product Shoot TVC mainly consists of people aged 16 to 35 who </w:t>
+      </w:r>
+      <w:r>
+        <w:t>have</w:t>
+      </w:r>
+      <w:r>
+        <w:t xml:space="preserve"> active</w:t>
+      </w:r>
+      <w:r>
+        <w:t xml:space="preserve"> or</w:t>
+      </w:r>
+      <w:r>
+        <w:t xml:space="preserve"> laid</w:t>
+      </w:r>
+      <w:r>
+        <w:t>back</w:t>
+      </w:r>
+      <w:r>
+        <w:t xml:space="preserve"> lifestyles. This group includes students, office workers, gym-goers, and outdoor lovers. They’re likely to connect with content on digital platforms like YouTube and Instagram.</w:t>
+      </w:r>
+    </w:p>
+    <w:p>
+      <w:r>
+        <w:t>This demographic is a perfect fit since the product’s features</w:t>
+      </w:r>
+      <w:r>
+        <w:t xml:space="preserve">, </w:t>
+      </w:r>
+      <w:r>
+        <w:t>like portability, reusability, and convenience</w:t>
+      </w:r>
+      <w:r>
+        <w:t xml:space="preserve">, </w:t>
+      </w:r>
+      <w:r>
+        <w:t>match their everyday routines. Plus, the use of fast-paced visuals and modern editing techniques is designed to attract younger viewers who enjoy dynamic and visually captivating content.</w:t>
+      </w:r>
+    </w:p>
+    <w:p>
+      <w:pPr>
+        <w:spacing w:before="60" w:after="0"/>
         <w:rPr>
           <w:b/>
           <w:color w:val="000000"/>
@@ -1903,45 +2205,247 @@
         </w:rPr>
       </w:pPr>
       <w:r>
+        <w:br w:type="page"/>
+      </w:r>
+    </w:p>
+    <w:p>
+      <w:pPr>
+        <w:rPr>
+          <w:b/>
+          <w:color w:val="000000"/>
+          <w:sz w:val="32"/>
+          <w:szCs w:val="28"/>
+        </w:rPr>
+      </w:pPr>
+      <w:r>
+        <w:rPr>
+          <w:b/>
+          <w:color w:val="000000"/>
+          <w:sz w:val="32"/>
+          <w:szCs w:val="28"/>
+        </w:rPr>
+        <w:lastRenderedPageBreak/>
+        <w:t>4</w:t>
+      </w:r>
+      <w:r>
+        <w:rPr>
+          <w:b/>
+          <w:color w:val="000000"/>
+          <w:sz w:val="32"/>
+          <w:szCs w:val="28"/>
+        </w:rPr>
+        <w:t xml:space="preserve">. </w:t>
+      </w:r>
+      <w:r>
+        <w:rPr>
+          <w:b/>
+          <w:color w:val="000000"/>
+          <w:sz w:val="32"/>
+          <w:szCs w:val="28"/>
+        </w:rPr>
+        <w:t>Project Research</w:t>
+      </w:r>
+    </w:p>
+    <w:p>
+      <w:pPr>
+        <w:rPr>
+          <w:color w:val="EE0000"/>
+        </w:rPr>
+      </w:pPr>
+      <w:r>
+        <w:rPr>
+          <w:color w:val="EE0000"/>
+        </w:rPr>
+        <w:t>Not sure what to write</w:t>
+      </w:r>
+      <w:r>
+        <w:rPr>
+          <w:color w:val="EE0000"/>
+        </w:rPr>
+        <w:t xml:space="preserve"> (do we write from the previous research?)</w:t>
+      </w:r>
+    </w:p>
+    <w:p>
+      <w:pPr>
+        <w:rPr>
+          <w:color w:val="000000"/>
+        </w:rPr>
+      </w:pPr>
+      <w:r>
+        <w:br w:type="page"/>
+      </w:r>
+    </w:p>
+    <w:p>
+      <w:pPr>
+        <w:pStyle w:val="Heading1"/>
+      </w:pPr>
+      <w:bookmarkStart w:id="7" w:name="_Toc227352501"/>
+      <w:r>
+        <w:lastRenderedPageBreak/>
+        <w:t>5</w:t>
+      </w:r>
+      <w:r>
+        <w:t xml:space="preserve">. </w:t>
+      </w:r>
+      <w:r>
+        <w:t>Technologies Employed</w:t>
+      </w:r>
+      <w:bookmarkEnd w:id="7"/>
+    </w:p>
+    <w:p>
+      <w:r>
+        <w:t>The project made use of a variety of hardware and software tools to deliver a polished final product. On the hardware side, a Sony A7IV camera paired with lenses like the 24–105mm, 16–35mm, and 50mm</w:t>
+      </w:r>
+      <w:r>
+        <w:t xml:space="preserve"> were </w:t>
+      </w:r>
+      <w:r>
+        <w:t>used, which</w:t>
+      </w:r>
+      <w:r>
+        <w:t xml:space="preserve"> allowed us to capture a wide range of shots</w:t>
+      </w:r>
+      <w:r>
+        <w:t>, which consisted of</w:t>
+      </w:r>
+      <w:r>
+        <w:t xml:space="preserve"> </w:t>
+      </w:r>
+      <w:r>
+        <w:t xml:space="preserve">wide angles to intimate close-ups and intricate detail shots. </w:t>
+      </w:r>
+    </w:p>
+    <w:p>
+      <w:r>
+        <w:t>For the software,</w:t>
+      </w:r>
+      <w:r>
+        <w:t xml:space="preserve"> </w:t>
+      </w:r>
+      <w:r>
+        <w:t>for</w:t>
+      </w:r>
+      <w:r>
+        <w:t xml:space="preserve"> colour correction and colour grading, DaVinci Resolve was used</w:t>
+      </w:r>
+      <w:r>
+        <w:t xml:space="preserve"> and the graded footages were imported in</w:t>
+      </w:r>
+      <w:r>
+        <w:t xml:space="preserve"> Adobe Premiere Pro for video </w:t>
+      </w:r>
+      <w:r>
+        <w:t>compilation remaining</w:t>
+      </w:r>
+      <w:r>
+        <w:t xml:space="preserve"> post-production work. </w:t>
+      </w:r>
+      <w:r>
+        <w:t>F</w:t>
+      </w:r>
+      <w:r>
+        <w:t xml:space="preserve">or </w:t>
+      </w:r>
+      <w:r>
+        <w:t>audio</w:t>
+      </w:r>
+      <w:r>
+        <w:t>, sites like Pixabay were used for sound effects</w:t>
+      </w:r>
+      <w:r>
+        <w:t xml:space="preserve"> These tools were carefully chosen to ensure high production standards </w:t>
+      </w:r>
+      <w:r>
+        <w:t>were maintained</w:t>
+      </w:r>
+      <w:r>
+        <w:t xml:space="preserve">. </w:t>
+      </w:r>
+    </w:p>
+    <w:p>
+      <w:pPr>
+        <w:rPr>
+          <w:color w:val="000000"/>
+          <w:sz w:val="28"/>
+          <w:szCs w:val="28"/>
+        </w:rPr>
+      </w:pPr>
+      <w:r>
+        <w:br w:type="page"/>
+      </w:r>
+    </w:p>
+    <w:p>
+      <w:pPr>
+        <w:pStyle w:val="Heading1"/>
+      </w:pPr>
+      <w:bookmarkStart w:id="8" w:name="_Toc227352502"/>
+      <w:r>
+        <w:lastRenderedPageBreak/>
+        <w:t>6.</w:t>
+      </w:r>
+      <w:r>
+        <w:t xml:space="preserve"> Target Audience</w:t>
+      </w:r>
+      <w:bookmarkEnd w:id="8"/>
+    </w:p>
+    <w:p>
+      <w:pPr>
+        <w:rPr>
+          <w:color w:val="000000"/>
+          <w:sz w:val="28"/>
+          <w:szCs w:val="28"/>
+        </w:rPr>
+      </w:pPr>
+      <w:r>
+        <w:t>The initial concept of the project was to create a product shoot within a controlled studio environment. However, this idea was later revised to include outdoor and real-life settings in order to better communicate the product’s portability and versatility.</w:t>
+      </w:r>
+    </w:p>
+    <w:p>
+      <w:r>
+        <w:t>Test shots and planning helped in identifying the need for a more dynamic approach. The final plan involved shooting in multiple locations, including sports and lifestyle environments, to create a more engaging and relatable commercial. Adjustments were made to the timeline to accommodate outdoor shooting and additional scene variations.</w:t>
+      </w:r>
+    </w:p>
+    <w:p>
+      <w:r>
+        <w:t>As a test, storyboards were created and shots were tested.</w:t>
+      </w:r>
+    </w:p>
+    <w:p>
+      <w:pPr>
+        <w:spacing w:before="60" w:after="0"/>
+        <w:ind w:left="432"/>
         <w:rPr>
           <w:i/>
-          <w:color w:val="808080"/>
-        </w:rPr>
-        <w:t>In this section, you are to mention the purpose of the project and what it will be useful for. Mention reasons for why it will be useful as well.</w:t>
-      </w:r>
-      <w:r>
-        <w:br w:type="page"/>
-      </w:r>
-    </w:p>
-    <w:p>
-      <w:pPr>
-        <w:pStyle w:val="Heading1"/>
-        <w:numPr>
-          <w:ilvl w:val="0"/>
-          <w:numId w:val="1"/>
-        </w:numPr>
-      </w:pPr>
-      <w:bookmarkStart w:id="5" w:name="_Toc227246554"/>
-      <w:r>
-        <w:lastRenderedPageBreak/>
-        <w:t>Target Audience</w:t>
-      </w:r>
-      <w:bookmarkEnd w:id="5"/>
-    </w:p>
-    <w:p>
-      <w:pPr>
+          <w:color w:val="EE0000"/>
+        </w:rPr>
+      </w:pPr>
+      <w:r>
+        <w:rPr>
+          <w:i/>
+          <w:color w:val="EE0000"/>
+        </w:rPr>
+        <w:t>Mention the initial plan that was done, mention what was used as a prototype/test scene and how the final product had been decided.</w:t>
+      </w:r>
+    </w:p>
+    <w:p>
+      <w:pPr>
+        <w:spacing w:before="60" w:after="0"/>
         <w:ind w:left="432"/>
+        <w:rPr>
+          <w:color w:val="EE0000"/>
+        </w:rPr>
       </w:pPr>
       <w:r>
         <w:rPr>
           <w:i/>
-          <w:color w:val="808080"/>
-        </w:rPr>
-        <w:t>Mention the target audience demographics such as Age, Gender, Ethnicity, Location etc. and give reasons to support why the outcome proves to be for those specific audiences.</w:t>
-      </w:r>
-    </w:p>
-    <w:p>
-      <w:pPr>
+          <w:color w:val="EE0000"/>
+        </w:rPr>
+        <w:t xml:space="preserve">Also mention what changes had to be done before you completed the final product in this section. (Compare old Timeline with New Timeline). </w:t>
+      </w:r>
+    </w:p>
+    <w:p>
+      <w:pPr>
+        <w:spacing w:before="60" w:after="0"/>
         <w:rPr>
           <w:b/>
           <w:color w:val="000000"/>
@@ -1956,74 +2460,97 @@
     <w:p>
       <w:pPr>
         <w:pStyle w:val="Heading1"/>
-        <w:numPr>
-          <w:ilvl w:val="0"/>
-          <w:numId w:val="1"/>
-        </w:numPr>
-      </w:pPr>
-      <w:bookmarkStart w:id="6" w:name="_Toc227246555"/>
+      </w:pPr>
+      <w:bookmarkStart w:id="9" w:name="_Toc227352503"/>
       <w:r>
         <w:lastRenderedPageBreak/>
-        <w:t>Product Research</w:t>
-      </w:r>
-      <w:bookmarkEnd w:id="6"/>
-    </w:p>
-    <w:p>
-      <w:pPr>
+        <w:t>7</w:t>
+      </w:r>
+      <w:r>
+        <w:t xml:space="preserve">. </w:t>
+      </w:r>
+      <w:r>
+        <w:t>Production Phases</w:t>
+      </w:r>
+      <w:bookmarkEnd w:id="9"/>
+    </w:p>
+    <w:p>
+      <w:pPr>
+        <w:pStyle w:val="Heading2"/>
+      </w:pPr>
+      <w:bookmarkStart w:id="10" w:name="_Toc227352504"/>
+      <w:r>
+        <w:t xml:space="preserve">7.1 </w:t>
+      </w:r>
+      <w:proofErr w:type="gramStart"/>
+      <w:r>
+        <w:t>Pre-production</w:t>
+      </w:r>
+      <w:bookmarkEnd w:id="10"/>
+      <w:proofErr w:type="gramEnd"/>
+    </w:p>
+    <w:p>
+      <w:r>
+        <w:t>This phase involved planning the concept, developing ideas, and creating a basic shot list. Decisions regarding locations, camera angles, and lighting setups were made during this stage</w:t>
+      </w:r>
+      <w:r>
+        <w:t xml:space="preserve"> and casting for the characters on the TVC were also conducted.</w:t>
+      </w:r>
+    </w:p>
+    <w:p>
+      <w:pPr>
+        <w:pStyle w:val="Heading2"/>
+      </w:pPr>
+      <w:bookmarkStart w:id="11" w:name="_Toc227352505"/>
+      <w:r>
+        <w:t xml:space="preserve">7.2 </w:t>
+      </w:r>
+      <w:r>
+        <w:t>Production</w:t>
+      </w:r>
+      <w:bookmarkEnd w:id="11"/>
+    </w:p>
+    <w:p>
+      <w:r>
+        <w:t>The production phase involved capturing footage in both indoor and outdoor environments. Various shots, including close-ups, slow-motion sequences, and dynamic movements, were recorded to highlight the product effectively.</w:t>
+      </w:r>
+    </w:p>
+    <w:p>
+      <w:pPr>
+        <w:pStyle w:val="Heading2"/>
+      </w:pPr>
+      <w:bookmarkStart w:id="12" w:name="_Toc227352506"/>
+      <w:r>
+        <w:t xml:space="preserve">7.3 </w:t>
+      </w:r>
+      <w:proofErr w:type="gramStart"/>
+      <w:r>
+        <w:t>Post-production</w:t>
+      </w:r>
+      <w:bookmarkEnd w:id="12"/>
+      <w:proofErr w:type="gramEnd"/>
+    </w:p>
+    <w:p>
+      <w:r>
+        <w:t>The post-production process involved selecting the best footage, arranging clips to create a smooth flow, and refining pacing to suit the commercial format. Colour correction and basic sound design were applied to enhance visual and audio quality. Feedback from peers was also considered to improve the final output.</w:t>
+      </w:r>
+    </w:p>
+    <w:p>
+      <w:pPr>
+        <w:spacing w:before="60" w:after="0"/>
         <w:ind w:left="432"/>
+      </w:pPr>
+      <w:r>
         <w:rPr>
           <w:i/>
-          <w:color w:val="808080"/>
-        </w:rPr>
-      </w:pPr>
-      <w:r>
-        <w:rPr>
-          <w:i/>
-          <w:color w:val="808080"/>
-        </w:rPr>
-        <w:t>Mention the contents researched upon which was used to develop the final product. This may include theories, techniques, new media practices and similar product reviews. Note: This should be different than the Literature Review and Product Review Contents.</w:t>
-      </w:r>
-    </w:p>
-    <w:p>
-      <w:pPr>
-        <w:rPr>
-          <w:i/>
-          <w:color w:val="808080"/>
-        </w:rPr>
-      </w:pPr>
-      <w:r>
-        <w:br w:type="page"/>
-      </w:r>
-    </w:p>
-    <w:p>
-      <w:pPr>
-        <w:pStyle w:val="Heading1"/>
-        <w:numPr>
-          <w:ilvl w:val="0"/>
-          <w:numId w:val="1"/>
-        </w:numPr>
-      </w:pPr>
-      <w:bookmarkStart w:id="7" w:name="_Toc227246556"/>
-      <w:r>
-        <w:lastRenderedPageBreak/>
-        <w:t>Technologies Employed</w:t>
-      </w:r>
-      <w:bookmarkEnd w:id="7"/>
-    </w:p>
-    <w:p>
-      <w:pPr>
-        <w:ind w:left="432"/>
-      </w:pPr>
-      <w:r>
-        <w:rPr>
-          <w:i/>
-          <w:color w:val="808080"/>
-        </w:rPr>
-        <w:t>Mention the technologies used to develop the product. This may include the use of software tools and techniques used to complete the product.</w:t>
-      </w:r>
-    </w:p>
-    <w:p>
-      <w:pPr>
+          <w:color w:val="EE0000"/>
+        </w:rPr>
+        <w:t>mention the details on what steps were carried out in each phases along with images and screenshots to complete the entire project.</w:t>
+      </w:r>
+    </w:p>
+    <w:p>
+      <w:pPr>
+        <w:spacing w:before="60" w:after="0"/>
         <w:rPr>
           <w:b/>
           <w:color w:val="000000"/>
@@ -2038,20 +2565,53 @@
     <w:p>
       <w:pPr>
         <w:pStyle w:val="Heading1"/>
-        <w:numPr>
-          <w:ilvl w:val="0"/>
-          <w:numId w:val="1"/>
-        </w:numPr>
-      </w:pPr>
-      <w:bookmarkStart w:id="8" w:name="_Toc227246557"/>
+      </w:pPr>
+      <w:bookmarkStart w:id="13" w:name="_Toc227352507"/>
       <w:r>
         <w:lastRenderedPageBreak/>
-        <w:t>Project Plan</w:t>
-      </w:r>
-      <w:bookmarkEnd w:id="8"/>
-    </w:p>
-    <w:p>
-      <w:pPr>
+        <w:t>8</w:t>
+      </w:r>
+      <w:r>
+        <w:t xml:space="preserve">. </w:t>
+      </w:r>
+      <w:r>
+        <w:t>Resources</w:t>
+      </w:r>
+      <w:bookmarkEnd w:id="13"/>
+    </w:p>
+    <w:p>
+      <w:r>
+        <w:t>The project required both hardware and software resources. Hardware included the camera, lenses, gimbal, and basic lighting equipment. Software resources included video editing tools such as Adobe Premiere Pro.</w:t>
+      </w:r>
+    </w:p>
+    <w:p>
+      <w:r>
+        <w:t>Additional resources included online research materials, reference commercials, and feedback tools such as Google Forms for evaluation. These resources supported both the production and evaluation stages of the project.</w:t>
+      </w:r>
+    </w:p>
+    <w:p/>
+    <w:p>
+      <w:r>
+        <w:t>The project required a combination of both hardware and software resources to ensure a professional production workflow. The primary hardware used included a Sony A7IV camera along with multiple lenses such as 24–105mm, 16–35mm, and 50mm, allowing flexibility in capturing a variety of shots including wide angles, close-ups, and detailed product shots. A gimbal (RS4 Pro) was also utilised to achieve smooth and stable camera movements, which is essential for maintaining a polished and cinematic look. In addition, basic lighting equipment was used to control exposure and highlight product features effectively, especially in controlled shooting environments.</w:t>
+      </w:r>
+    </w:p>
+    <w:p>
+      <w:r>
+        <w:t>In terms of software, Adobe Premiere Pro was used as the main editing tool for assembling and refining the video. Its features allowed for cutting</w:t>
+      </w:r>
+      <w:r>
+        <w:t xml:space="preserve"> and compilation, </w:t>
+      </w:r>
+      <w:r>
+        <w:t>and audio</w:t>
+      </w:r>
+      <w:r>
+        <w:t xml:space="preserve"> adjustments to enhance the overall quality of the TVC. Additional resources included online research materials and reference commercials, which helped guide the creative direction and visual style of the project. Furthermore, tools such as Google Forms were used during the evaluation phase to collect audience feedback efficiently. These combined resources supported both the production and post-production processes, contributing to the successful completion of the project.</w:t>
+      </w:r>
+    </w:p>
+    <w:p>
+      <w:pPr>
+        <w:spacing w:before="60" w:after="0"/>
         <w:ind w:left="432"/>
         <w:rPr>
           <w:i/>
@@ -2063,23 +2623,50 @@
           <w:i/>
           <w:color w:val="808080"/>
         </w:rPr>
-        <w:t>Mention the initial plan that was done, mention what was used as a prototype/test scene and how the final product had been decided.</w:t>
-      </w:r>
-    </w:p>
-    <w:p>
-      <w:pPr>
-        <w:ind w:left="432"/>
-      </w:pPr>
-      <w:r>
+        <w:t>List out the Hardware and Software Tools used to complete the project and mention if additional tools had to be used than what was mentioned in the Proposal. You are to also mention the Research and Testing Tools here.</w:t>
+      </w:r>
+    </w:p>
+    <w:p>
+      <w:pPr>
+        <w:spacing w:before="60" w:after="0"/>
         <w:rPr>
           <w:i/>
           <w:color w:val="808080"/>
         </w:rPr>
-        <w:t xml:space="preserve">Also mention what changes had to be done before you completed the final product in this section. (Compare old Timeline with New Timeline). </w:t>
-      </w:r>
-    </w:p>
-    <w:p>
-      <w:pPr>
+      </w:pPr>
+    </w:p>
+    <w:p>
+      <w:pPr>
+        <w:spacing w:before="60" w:after="0"/>
+        <w:rPr>
+          <w:i/>
+          <w:color w:val="808080"/>
+        </w:rPr>
+      </w:pPr>
+      <w:r>
+        <w:br w:type="page"/>
+      </w:r>
+    </w:p>
+    <w:p>
+      <w:pPr>
+        <w:pStyle w:val="Heading1"/>
+        <w:spacing w:before="60"/>
+        <w:ind w:left="0" w:firstLine="0"/>
+      </w:pPr>
+      <w:bookmarkStart w:id="14" w:name="_Toc227352508"/>
+      <w:r>
+        <w:lastRenderedPageBreak/>
+        <w:t xml:space="preserve">9. </w:t>
+      </w:r>
+      <w:r>
+        <w:t>User Testing &amp; Findings</w:t>
+      </w:r>
+      <w:bookmarkEnd w:id="14"/>
+    </w:p>
+    <w:p>
+      <w:pPr>
+        <w:spacing w:before="60" w:after="0"/>
+        <w:ind w:left="432"/>
         <w:rPr>
           <w:b/>
           <w:color w:val="000000"/>
@@ -2088,38 +2675,39 @@
         </w:rPr>
       </w:pPr>
       <w:r>
-        <w:br w:type="page"/>
-      </w:r>
-    </w:p>
-    <w:p>
-      <w:pPr>
-        <w:pStyle w:val="Heading1"/>
-        <w:numPr>
-          <w:ilvl w:val="0"/>
-          <w:numId w:val="1"/>
-        </w:numPr>
-      </w:pPr>
-      <w:bookmarkStart w:id="9" w:name="_Toc227246558"/>
-      <w:r>
-        <w:lastRenderedPageBreak/>
-        <w:t>Production Phases</w:t>
-      </w:r>
-      <w:bookmarkEnd w:id="9"/>
-    </w:p>
-    <w:p>
-      <w:pPr>
-        <w:ind w:left="432"/>
-      </w:pPr>
-      <w:r>
         <w:rPr>
           <w:i/>
           <w:color w:val="808080"/>
         </w:rPr>
-        <w:t>Mention the production Phases followed, depending on the project that you undertook, and mention the details on what steps were carried out in each phases along with images and screenshots to complete the entire project.</w:t>
-      </w:r>
-    </w:p>
-    <w:p>
-      <w:pPr>
+        <w:t>Mention the Tests that were conducted among the users and mention the finding in detail in this section.</w:t>
+      </w:r>
+      <w:r>
+        <w:br w:type="page"/>
+      </w:r>
+    </w:p>
+    <w:p>
+      <w:pPr>
+        <w:pStyle w:val="Heading1"/>
+        <w:spacing w:before="60"/>
+        <w:ind w:left="0" w:firstLine="0"/>
+      </w:pPr>
+      <w:bookmarkStart w:id="15" w:name="_Toc227352509"/>
+      <w:r>
+        <w:lastRenderedPageBreak/>
+        <w:t>10</w:t>
+      </w:r>
+      <w:r>
+        <w:t xml:space="preserve">. </w:t>
+      </w:r>
+      <w:r>
+        <w:t>Conclusion</w:t>
+      </w:r>
+      <w:bookmarkEnd w:id="15"/>
+    </w:p>
+    <w:p>
+      <w:pPr>
+        <w:spacing w:before="60" w:after="0"/>
+        <w:ind w:left="432"/>
         <w:rPr>
           <w:b/>
           <w:color w:val="000000"/>
@@ -2128,69 +2716,55 @@
         </w:rPr>
       </w:pPr>
       <w:r>
-        <w:br w:type="page"/>
-      </w:r>
-    </w:p>
-    <w:p>
-      <w:pPr>
-        <w:pStyle w:val="Heading1"/>
-        <w:numPr>
-          <w:ilvl w:val="0"/>
-          <w:numId w:val="1"/>
-        </w:numPr>
-      </w:pPr>
-      <w:bookmarkStart w:id="10" w:name="_Toc227246559"/>
-      <w:r>
-        <w:lastRenderedPageBreak/>
-        <w:t>Resources</w:t>
-      </w:r>
-      <w:bookmarkEnd w:id="10"/>
-    </w:p>
-    <w:p>
-      <w:pPr>
-        <w:ind w:left="432"/>
         <w:rPr>
           <w:i/>
           <w:color w:val="808080"/>
         </w:rPr>
-      </w:pPr>
-      <w:r>
+        <w:t>Mention the overall conclusion of the project, things that were covered in this documentation and what this project has accomplished.  (Note: You are not to mention your experiences here)</w:t>
+      </w:r>
+      <w:r>
+        <w:br w:type="page"/>
+      </w:r>
+    </w:p>
+    <w:p>
+      <w:pPr>
+        <w:pStyle w:val="Heading1"/>
+        <w:spacing w:before="60"/>
+        <w:ind w:left="0" w:firstLine="0"/>
+      </w:pPr>
+      <w:bookmarkStart w:id="16" w:name="_Toc227352510"/>
+      <w:r>
+        <w:lastRenderedPageBreak/>
+        <w:t>11</w:t>
+      </w:r>
+      <w:r>
+        <w:t xml:space="preserve">. </w:t>
+      </w:r>
+      <w:r>
+        <w:t>References</w:t>
+      </w:r>
+      <w:bookmarkEnd w:id="16"/>
+    </w:p>
+    <w:p>
+      <w:pPr>
+        <w:spacing w:before="60" w:after="0"/>
+        <w:ind w:left="432"/>
         <w:rPr>
           <w:i/>
           <w:color w:val="808080"/>
         </w:rPr>
-        <w:t>List out the Hardware and Software Tools used to complete the project and mention if additional tools had to be used than what was mentioned in the Proposal. You are to also mention the Research and Testing Tools here.</w:t>
-      </w:r>
-    </w:p>
-    <w:p>
-      <w:pPr>
+      </w:pPr>
+      <w:r>
         <w:rPr>
           <w:i/>
           <w:color w:val="808080"/>
         </w:rPr>
-      </w:pPr>
-      <w:r>
-        <w:br w:type="page"/>
-      </w:r>
-    </w:p>
-    <w:p>
-      <w:pPr>
-        <w:pStyle w:val="Heading1"/>
-        <w:numPr>
-          <w:ilvl w:val="0"/>
-          <w:numId w:val="1"/>
-        </w:numPr>
-      </w:pPr>
-      <w:bookmarkStart w:id="11" w:name="_Toc227246560"/>
-      <w:r>
-        <w:lastRenderedPageBreak/>
-        <w:t>User Testing &amp; Findings</w:t>
-      </w:r>
-      <w:bookmarkEnd w:id="11"/>
-    </w:p>
-    <w:p>
-      <w:pPr>
-        <w:ind w:left="432"/>
+        <w:t>List all your references here with direct citation. (Words not counted)</w:t>
+      </w:r>
+    </w:p>
+    <w:p>
+      <w:pPr>
+        <w:spacing w:before="60" w:after="0"/>
         <w:rPr>
           <w:b/>
           <w:color w:val="000000"/>
@@ -2199,34 +2773,55 @@
         </w:rPr>
       </w:pPr>
       <w:r>
+        <w:br w:type="page"/>
+      </w:r>
+    </w:p>
+    <w:p>
+      <w:pPr>
+        <w:pStyle w:val="Heading1"/>
+        <w:spacing w:before="60"/>
+        <w:ind w:left="0" w:firstLine="0"/>
+      </w:pPr>
+      <w:bookmarkStart w:id="17" w:name="_Toc227352511"/>
+      <w:r>
+        <w:lastRenderedPageBreak/>
+        <w:t>1</w:t>
+      </w:r>
+      <w:r>
+        <w:t>2.</w:t>
+      </w:r>
+      <w:r>
+        <w:t xml:space="preserve"> </w:t>
+      </w:r>
+      <w:r>
+        <w:t>Bibliography</w:t>
+      </w:r>
+      <w:bookmarkEnd w:id="17"/>
+    </w:p>
+    <w:p>
+      <w:pPr>
+        <w:spacing w:before="60" w:after="0"/>
+        <w:ind w:left="432"/>
+        <w:rPr>
+          <w:i/>
+        </w:rPr>
+      </w:pPr>
+      <w:r>
         <w:rPr>
           <w:i/>
           <w:color w:val="808080"/>
         </w:rPr>
-        <w:t>Mention the Tests that were conducted among the users and mention the finding in detail in this section.</w:t>
-      </w:r>
-      <w:r>
-        <w:br w:type="page"/>
-      </w:r>
-    </w:p>
-    <w:p>
-      <w:pPr>
-        <w:pStyle w:val="Heading1"/>
-        <w:numPr>
-          <w:ilvl w:val="0"/>
-          <w:numId w:val="1"/>
-        </w:numPr>
-      </w:pPr>
-      <w:bookmarkStart w:id="12" w:name="_Toc227246561"/>
-      <w:r>
-        <w:lastRenderedPageBreak/>
-        <w:t>Conclusion</w:t>
-      </w:r>
-      <w:bookmarkEnd w:id="12"/>
-    </w:p>
-    <w:p>
-      <w:pPr>
-        <w:ind w:left="432"/>
+        <w:t>List all your bibliographies here which you researched about that indirectly helped you to understand the concept to carry out your project. (Words not counted)</w:t>
+      </w:r>
+    </w:p>
+    <w:p>
+      <w:pPr>
+        <w:spacing w:before="60" w:after="0"/>
+      </w:pPr>
+    </w:p>
+    <w:p>
+      <w:pPr>
+        <w:spacing w:before="60" w:after="0"/>
         <w:rPr>
           <w:b/>
           <w:color w:val="000000"/>
@@ -2235,135 +2830,52 @@
         </w:rPr>
       </w:pPr>
       <w:r>
+        <w:br w:type="page"/>
+      </w:r>
+    </w:p>
+    <w:p>
+      <w:pPr>
+        <w:pStyle w:val="Heading1"/>
+        <w:spacing w:before="60"/>
+        <w:ind w:left="0" w:firstLine="0"/>
+      </w:pPr>
+      <w:bookmarkStart w:id="18" w:name="_Toc227352512"/>
+      <w:r>
+        <w:lastRenderedPageBreak/>
+        <w:t>1</w:t>
+      </w:r>
+      <w:r>
+        <w:t>3</w:t>
+      </w:r>
+      <w:r>
+        <w:t xml:space="preserve">. </w:t>
+      </w:r>
+      <w:r>
+        <w:t>Appendix</w:t>
+      </w:r>
+      <w:bookmarkEnd w:id="18"/>
+    </w:p>
+    <w:p>
+      <w:pPr>
+        <w:spacing w:before="60" w:after="0"/>
+        <w:ind w:left="432"/>
+        <w:rPr>
+          <w:i/>
+        </w:rPr>
+      </w:pPr>
+      <w:r>
         <w:rPr>
           <w:i/>
           <w:color w:val="808080"/>
         </w:rPr>
-        <w:t>Mention the overall conclusion of the project, things that were covered in this documentation and what this project has accomplished.  (Note: You are not to mention your experiences here)</w:t>
-      </w:r>
-      <w:r>
-        <w:br w:type="page"/>
-      </w:r>
-    </w:p>
-    <w:p>
-      <w:pPr>
-        <w:pStyle w:val="Heading1"/>
-        <w:numPr>
-          <w:ilvl w:val="0"/>
-          <w:numId w:val="1"/>
-        </w:numPr>
-      </w:pPr>
-      <w:bookmarkStart w:id="13" w:name="_Toc227246562"/>
-      <w:r>
-        <w:lastRenderedPageBreak/>
-        <w:t>References</w:t>
-      </w:r>
-      <w:bookmarkEnd w:id="13"/>
-    </w:p>
-    <w:p>
-      <w:pPr>
-        <w:ind w:left="432"/>
-        <w:rPr>
-          <w:i/>
-          <w:color w:val="808080"/>
-        </w:rPr>
-      </w:pPr>
-      <w:r>
-        <w:rPr>
-          <w:i/>
-          <w:color w:val="808080"/>
-        </w:rPr>
-        <w:t>List all your references here with direct citation. (Words not counted)</w:t>
-      </w:r>
-    </w:p>
-    <w:p>
-      <w:pPr>
-        <w:rPr>
-          <w:b/>
-          <w:color w:val="000000"/>
-          <w:sz w:val="28"/>
-          <w:szCs w:val="28"/>
-        </w:rPr>
-      </w:pPr>
-      <w:r>
-        <w:br w:type="page"/>
-      </w:r>
-    </w:p>
-    <w:p>
-      <w:pPr>
-        <w:pStyle w:val="Heading1"/>
-        <w:numPr>
-          <w:ilvl w:val="0"/>
-          <w:numId w:val="1"/>
-        </w:numPr>
-      </w:pPr>
-      <w:bookmarkStart w:id="14" w:name="_Toc227246563"/>
-      <w:r>
-        <w:lastRenderedPageBreak/>
-        <w:t>Bibliography</w:t>
-      </w:r>
-      <w:bookmarkEnd w:id="14"/>
-    </w:p>
-    <w:p>
-      <w:pPr>
-        <w:ind w:left="432"/>
-        <w:rPr>
-          <w:i/>
-        </w:rPr>
-      </w:pPr>
-      <w:r>
-        <w:rPr>
-          <w:i/>
-          <w:color w:val="808080"/>
-        </w:rPr>
-        <w:t>List all your bibliographies here which you researched about that indirectly helped you to understand the concept to carry out your project. (Words not counted)</w:t>
-      </w:r>
-    </w:p>
-    <w:p/>
-    <w:p>
-      <w:pPr>
-        <w:rPr>
-          <w:b/>
-          <w:color w:val="000000"/>
-          <w:sz w:val="28"/>
-          <w:szCs w:val="28"/>
-        </w:rPr>
-      </w:pPr>
-      <w:r>
-        <w:br w:type="page"/>
-      </w:r>
-    </w:p>
-    <w:p>
-      <w:pPr>
-        <w:pStyle w:val="Heading1"/>
-        <w:numPr>
-          <w:ilvl w:val="0"/>
-          <w:numId w:val="1"/>
-        </w:numPr>
-      </w:pPr>
-      <w:bookmarkStart w:id="15" w:name="_Toc227246564"/>
-      <w:r>
-        <w:lastRenderedPageBreak/>
-        <w:t>Appendix</w:t>
-      </w:r>
-      <w:bookmarkEnd w:id="15"/>
-    </w:p>
-    <w:p>
-      <w:pPr>
-        <w:ind w:left="432"/>
-        <w:rPr>
-          <w:i/>
-        </w:rPr>
-      </w:pPr>
-      <w:r>
-        <w:rPr>
-          <w:i/>
-          <w:color w:val="808080"/>
-        </w:rPr>
         <w:t>Keep all your supporting documents such as Gantt Chart, Survey Results, Interview and other details here (Words not counted)</w:t>
       </w:r>
     </w:p>
-    <w:p/>
+    <w:p>
+      <w:pPr>
+        <w:spacing w:before="60" w:after="0"/>
+      </w:pPr>
+    </w:p>
     <w:sectPr>
       <w:footerReference w:type="default" r:id="rId10"/>
       <w:pgSz w:w="12240" w:h="15840"/>
@@ -2401,64 +2913,6 @@
 </file>
 
 <file path=word/footer1.xml><?xml version="1.0" encoding="utf-8"?>
-<w:ftr xmlns:wpc="http://schemas.microsoft.com/office/word/2010/wordprocessingCanvas" xmlns:cx="http://schemas.microsoft.com/office/drawing/2014/chartex" xmlns:cx1="http://schemas.microsoft.com/office/drawing/2015/9/8/chartex" xmlns:cx2="http://schemas.microsoft.com/office/drawing/2015/10/21/chartex" xmlns:cx3="http://schemas.microsoft.com/office/drawing/2016/5/9/chartex" xmlns:cx4="http://schemas.microsoft.com/office/drawing/2016/5/10/chartex" xmlns:cx5="http://schemas.microsoft.com/office/drawing/2016/5/11/chartex" xmlns:cx6="http://schemas.microsoft.com/office/drawing/2016/5/12/chartex" xmlns:cx7="http://schemas.microsoft.com/office/drawing/2016/5/13/chartex" xmlns:cx8="http://schemas.microsoft.com/office/drawing/2016/5/14/chartex" xmlns:mc="http://schemas.openxmlformats.org/markup-compatibility/2006" xmlns:aink="http://schemas.microsoft.com/office/drawing/2016/ink" xmlns:am3d="http://schemas.microsoft.com/office/drawing/2017/model3d" xmlns:o="urn:schemas-microsoft-com:office:office" xmlns:oel="http://schemas.microsoft.com/office/2019/extlst" xmlns:r="http://schemas.openxmlformats.org/officeDocument/2006/relationships" xmlns:m="http://schemas.openxmlformats.org/officeDocument/2006/math" xmlns:v="urn:schemas-microsoft-com:vml" xmlns:wp14="http://schemas.microsoft.com/office/word/2010/wordprocessingDrawing" xmlns:wp="http://schemas.openxmlformats.org/drawingml/2006/wordprocessingDrawing" xmlns:w10="urn:schemas-microsoft-com:office:word" xmlns:w="http://schemas.openxmlformats.org/wordprocessingml/2006/main" xmlns:w14="http://schemas.microsoft.com/office/word/2010/wordml" xmlns:w15="http://schemas.microsoft.com/office/word/2012/wordml" xmlns:w16cex="http://schemas.microsoft.com/office/word/2018/wordml/cex" xmlns:w16cid="http://schemas.microsoft.com/office/word/2016/wordml/cid" xmlns:w16="http://schemas.microsoft.com/office/word/2018/wordml" xmlns:w16du="http://schemas.microsoft.com/office/word/2023/wordml/word16du" xmlns:w16sdtdh="http://schemas.microsoft.com/office/word/2020/wordml/sdtdatahash" xmlns:w16sdtfl="http://schemas.microsoft.com/office/word/2024/wordml/sdtformatlock" xmlns:w16se="http://schemas.microsoft.com/office/word/2015/wordml/symex" xmlns:wpg="http://schemas.microsoft.com/office/word/2010/wordprocessingGroup" xmlns:wpi="http://schemas.microsoft.com/office/word/2010/wordprocessingInk" xmlns:wne="http://schemas.microsoft.com/office/word/2006/wordml" xmlns:wps="http://schemas.microsoft.com/office/word/2010/wordprocessingShape" mc:Ignorable="w14 w15 w16se w16cid w16 w16cex w16sdtdh w16sdtfl w16du wp14">
-  <w:sdt>
-    <w:sdtPr>
-      <w:rPr>
-        <w:rStyle w:val="PageNumber"/>
-      </w:rPr>
-      <w:id w:val="-1770305753"/>
-      <w:docPartObj>
-        <w:docPartGallery w:val="Page Numbers (Bottom of Page)"/>
-        <w:docPartUnique/>
-      </w:docPartObj>
-    </w:sdtPr>
-    <w:sdtContent>
-      <w:p>
-        <w:pPr>
-          <w:pStyle w:val="Footer"/>
-          <w:framePr w:wrap="none" w:vAnchor="text" w:hAnchor="margin" w:y="1"/>
-          <w:rPr>
-            <w:rStyle w:val="PageNumber"/>
-          </w:rPr>
-        </w:pPr>
-        <w:r>
-          <w:rPr>
-            <w:rStyle w:val="PageNumber"/>
-          </w:rPr>
-          <w:fldChar w:fldCharType="begin"/>
-        </w:r>
-        <w:r>
-          <w:rPr>
-            <w:rStyle w:val="PageNumber"/>
-          </w:rPr>
-          <w:instrText xml:space="preserve"> PAGE </w:instrText>
-        </w:r>
-        <w:r>
-          <w:rPr>
-            <w:rStyle w:val="PageNumber"/>
-          </w:rPr>
-          <w:fldChar w:fldCharType="separate"/>
-        </w:r>
-        <w:r>
-          <w:rPr>
-            <w:rStyle w:val="PageNumber"/>
-          </w:rPr>
-          <w:fldChar w:fldCharType="end"/>
-        </w:r>
-      </w:p>
-    </w:sdtContent>
-  </w:sdt>
-  <w:p>
-    <w:pPr>
-      <w:pStyle w:val="Footer"/>
-      <w:ind w:firstLine="360"/>
-    </w:pPr>
-  </w:p>
-</w:ftr>
-</file>
-
-<file path=word/footer2.xml><?xml version="1.0" encoding="utf-8"?>
 <w:ftr xmlns:wpc="http://schemas.microsoft.com/office/word/2010/wordprocessingCanvas" xmlns:cx="http://schemas.microsoft.com/office/drawing/2014/chartex" xmlns:cx1="http://schemas.microsoft.com/office/drawing/2015/9/8/chartex" xmlns:cx2="http://schemas.microsoft.com/office/drawing/2015/10/21/chartex" xmlns:cx3="http://schemas.microsoft.com/office/drawing/2016/5/9/chartex" xmlns:cx4="http://schemas.microsoft.com/office/drawing/2016/5/10/chartex" xmlns:cx5="http://schemas.microsoft.com/office/drawing/2016/5/11/chartex" xmlns:cx6="http://schemas.microsoft.com/office/drawing/2016/5/12/chartex" xmlns:cx7="http://schemas.microsoft.com/office/drawing/2016/5/13/chartex" xmlns:cx8="http://schemas.microsoft.com/office/drawing/2016/5/14/chartex" xmlns:mc="http://schemas.openxmlformats.org/markup-compatibility/2006" xmlns:aink="http://schemas.microsoft.com/office/drawing/2016/ink" xmlns:am3d="http://schemas.microsoft.com/office/drawing/2017/model3d" xmlns:o="urn:schemas-microsoft-com:office:office" xmlns:oel="http://schemas.microsoft.com/office/2019/extlst" xmlns:r="http://schemas.openxmlformats.org/officeDocument/2006/relationships" xmlns:m="http://schemas.openxmlformats.org/officeDocument/2006/math" xmlns:v="urn:schemas-microsoft-com:vml" xmlns:wp14="http://schemas.microsoft.com/office/word/2010/wordprocessingDrawing" xmlns:wp="http://schemas.openxmlformats.org/drawingml/2006/wordprocessingDrawing" xmlns:w10="urn:schemas-microsoft-com:office:word" xmlns:w="http://schemas.openxmlformats.org/wordprocessingml/2006/main" xmlns:w14="http://schemas.microsoft.com/office/word/2010/wordml" xmlns:w15="http://schemas.microsoft.com/office/word/2012/wordml" xmlns:w16cex="http://schemas.microsoft.com/office/word/2018/wordml/cex" xmlns:w16cid="http://schemas.microsoft.com/office/word/2016/wordml/cid" xmlns:w16="http://schemas.microsoft.com/office/word/2018/wordml" xmlns:w16du="http://schemas.microsoft.com/office/word/2023/wordml/word16du" xmlns:w16sdtdh="http://schemas.microsoft.com/office/word/2020/wordml/sdtdatahash" xmlns:w16sdtfl="http://schemas.microsoft.com/office/word/2024/wordml/sdtformatlock" xmlns:w16se="http://schemas.microsoft.com/office/word/2015/wordml/symex" xmlns:wpg="http://schemas.microsoft.com/office/word/2010/wordprocessingGroup" xmlns:wpi="http://schemas.microsoft.com/office/word/2010/wordprocessingInk" xmlns:wne="http://schemas.microsoft.com/office/word/2006/wordml" xmlns:wps="http://schemas.microsoft.com/office/word/2010/wordprocessingShape" mc:Ignorable="w14 w15 w16se w16cid w16 w16cex w16sdtdh w16sdtfl w16du wp14">
   <w:sdt>
     <w:sdtPr>
@@ -2674,6 +3128,338 @@
     </w:lvl>
   </w:abstractNum>
   <w:abstractNum w:abstractNumId="1" w15:restartNumberingAfterBreak="0">
+    <w:nsid w:val="2AE3773D"/>
+    <w:multiLevelType w:val="multilevel"/>
+    <w:tmpl w:val="D5C46D58"/>
+    <w:lvl w:ilvl="0">
+      <w:start w:val="1"/>
+      <w:numFmt w:val="decimal"/>
+      <w:lvlText w:val="%1."/>
+      <w:lvlJc w:val="left"/>
+      <w:pPr>
+        <w:ind w:left="0" w:firstLine="0"/>
+      </w:pPr>
+      <w:rPr>
+        <w:rFonts w:ascii="Arial" w:eastAsia="Arial" w:hAnsi="Arial" w:cs="Arial" w:hint="default"/>
+      </w:rPr>
+    </w:lvl>
+    <w:lvl w:ilvl="1">
+      <w:start w:val="1"/>
+      <w:numFmt w:val="decimal"/>
+      <w:isLgl/>
+      <w:lvlText w:val="%1.%2"/>
+      <w:lvlJc w:val="left"/>
+      <w:pPr>
+        <w:ind w:left="737" w:hanging="737"/>
+      </w:pPr>
+      <w:rPr>
+        <w:rFonts w:hint="default"/>
+      </w:rPr>
+    </w:lvl>
+    <w:lvl w:ilvl="2">
+      <w:start w:val="1"/>
+      <w:numFmt w:val="decimal"/>
+      <w:isLgl/>
+      <w:lvlText w:val="%1.%2.%3"/>
+      <w:lvlJc w:val="left"/>
+      <w:pPr>
+        <w:ind w:left="1080" w:hanging="720"/>
+      </w:pPr>
+      <w:rPr>
+        <w:rFonts w:hint="default"/>
+      </w:rPr>
+    </w:lvl>
+    <w:lvl w:ilvl="3">
+      <w:start w:val="1"/>
+      <w:numFmt w:val="decimal"/>
+      <w:isLgl/>
+      <w:lvlText w:val="%1.%2.%3.%4"/>
+      <w:lvlJc w:val="left"/>
+      <w:pPr>
+        <w:ind w:left="1440" w:hanging="1080"/>
+      </w:pPr>
+      <w:rPr>
+        <w:rFonts w:hint="default"/>
+      </w:rPr>
+    </w:lvl>
+    <w:lvl w:ilvl="4">
+      <w:start w:val="1"/>
+      <w:numFmt w:val="decimal"/>
+      <w:isLgl/>
+      <w:lvlText w:val="%1.%2.%3.%4.%5"/>
+      <w:lvlJc w:val="left"/>
+      <w:pPr>
+        <w:ind w:left="1440" w:hanging="1080"/>
+      </w:pPr>
+      <w:rPr>
+        <w:rFonts w:hint="default"/>
+      </w:rPr>
+    </w:lvl>
+    <w:lvl w:ilvl="5">
+      <w:start w:val="1"/>
+      <w:numFmt w:val="decimal"/>
+      <w:isLgl/>
+      <w:lvlText w:val="%1.%2.%3.%4.%5.%6"/>
+      <w:lvlJc w:val="left"/>
+      <w:pPr>
+        <w:ind w:left="1800" w:hanging="1440"/>
+      </w:pPr>
+      <w:rPr>
+        <w:rFonts w:hint="default"/>
+      </w:rPr>
+    </w:lvl>
+    <w:lvl w:ilvl="6">
+      <w:start w:val="1"/>
+      <w:numFmt w:val="decimal"/>
+      <w:isLgl/>
+      <w:lvlText w:val="%1.%2.%3.%4.%5.%6.%7"/>
+      <w:lvlJc w:val="left"/>
+      <w:pPr>
+        <w:ind w:left="1800" w:hanging="1440"/>
+      </w:pPr>
+      <w:rPr>
+        <w:rFonts w:hint="default"/>
+      </w:rPr>
+    </w:lvl>
+    <w:lvl w:ilvl="7">
+      <w:start w:val="1"/>
+      <w:numFmt w:val="decimal"/>
+      <w:isLgl/>
+      <w:lvlText w:val="%1.%2.%3.%4.%5.%6.%7.%8"/>
+      <w:lvlJc w:val="left"/>
+      <w:pPr>
+        <w:ind w:left="2160" w:hanging="1800"/>
+      </w:pPr>
+      <w:rPr>
+        <w:rFonts w:hint="default"/>
+      </w:rPr>
+    </w:lvl>
+    <w:lvl w:ilvl="8">
+      <w:start w:val="1"/>
+      <w:numFmt w:val="decimal"/>
+      <w:isLgl/>
+      <w:lvlText w:val="%1.%2.%3.%4.%5.%6.%7.%8.%9"/>
+      <w:lvlJc w:val="left"/>
+      <w:pPr>
+        <w:ind w:left="2160" w:hanging="1800"/>
+      </w:pPr>
+      <w:rPr>
+        <w:rFonts w:hint="default"/>
+      </w:rPr>
+    </w:lvl>
+  </w:abstractNum>
+  <w:abstractNum w:abstractNumId="2" w15:restartNumberingAfterBreak="0">
+    <w:nsid w:val="4300174E"/>
+    <w:multiLevelType w:val="hybridMultilevel"/>
+    <w:tmpl w:val="9F0E525E"/>
+    <w:lvl w:ilvl="0" w:tplc="0409000F">
+      <w:start w:val="1"/>
+      <w:numFmt w:val="decimal"/>
+      <w:lvlText w:val="%1."/>
+      <w:lvlJc w:val="left"/>
+      <w:pPr>
+        <w:ind w:left="720" w:hanging="360"/>
+      </w:pPr>
+      <w:rPr>
+        <w:rFonts w:hint="default"/>
+      </w:rPr>
+    </w:lvl>
+    <w:lvl w:ilvl="1" w:tplc="04090019" w:tentative="1">
+      <w:start w:val="1"/>
+      <w:numFmt w:val="lowerLetter"/>
+      <w:lvlText w:val="%2."/>
+      <w:lvlJc w:val="left"/>
+      <w:pPr>
+        <w:ind w:left="1440" w:hanging="360"/>
+      </w:pPr>
+    </w:lvl>
+    <w:lvl w:ilvl="2" w:tplc="0409001B" w:tentative="1">
+      <w:start w:val="1"/>
+      <w:numFmt w:val="lowerRoman"/>
+      <w:lvlText w:val="%3."/>
+      <w:lvlJc w:val="right"/>
+      <w:pPr>
+        <w:ind w:left="2160" w:hanging="180"/>
+      </w:pPr>
+    </w:lvl>
+    <w:lvl w:ilvl="3" w:tplc="0409000F" w:tentative="1">
+      <w:start w:val="1"/>
+      <w:numFmt w:val="decimal"/>
+      <w:lvlText w:val="%4."/>
+      <w:lvlJc w:val="left"/>
+      <w:pPr>
+        <w:ind w:left="2880" w:hanging="360"/>
+      </w:pPr>
+    </w:lvl>
+    <w:lvl w:ilvl="4" w:tplc="04090019" w:tentative="1">
+      <w:start w:val="1"/>
+      <w:numFmt w:val="lowerLetter"/>
+      <w:lvlText w:val="%5."/>
+      <w:lvlJc w:val="left"/>
+      <w:pPr>
+        <w:ind w:left="3600" w:hanging="360"/>
+      </w:pPr>
+    </w:lvl>
+    <w:lvl w:ilvl="5" w:tplc="0409001B" w:tentative="1">
+      <w:start w:val="1"/>
+      <w:numFmt w:val="lowerRoman"/>
+      <w:lvlText w:val="%6."/>
+      <w:lvlJc w:val="right"/>
+      <w:pPr>
+        <w:ind w:left="4320" w:hanging="180"/>
+      </w:pPr>
+    </w:lvl>
+    <w:lvl w:ilvl="6" w:tplc="0409000F" w:tentative="1">
+      <w:start w:val="1"/>
+      <w:numFmt w:val="decimal"/>
+      <w:lvlText w:val="%7."/>
+      <w:lvlJc w:val="left"/>
+      <w:pPr>
+        <w:ind w:left="5040" w:hanging="360"/>
+      </w:pPr>
+    </w:lvl>
+    <w:lvl w:ilvl="7" w:tplc="04090019" w:tentative="1">
+      <w:start w:val="1"/>
+      <w:numFmt w:val="lowerLetter"/>
+      <w:lvlText w:val="%8."/>
+      <w:lvlJc w:val="left"/>
+      <w:pPr>
+        <w:ind w:left="5760" w:hanging="360"/>
+      </w:pPr>
+    </w:lvl>
+    <w:lvl w:ilvl="8" w:tplc="0409001B" w:tentative="1">
+      <w:start w:val="1"/>
+      <w:numFmt w:val="lowerRoman"/>
+      <w:lvlText w:val="%9."/>
+      <w:lvlJc w:val="right"/>
+      <w:pPr>
+        <w:ind w:left="6480" w:hanging="180"/>
+      </w:pPr>
+    </w:lvl>
+  </w:abstractNum>
+  <w:abstractNum w:abstractNumId="3" w15:restartNumberingAfterBreak="0">
+    <w:nsid w:val="45936B1A"/>
+    <w:multiLevelType w:val="multilevel"/>
+    <w:tmpl w:val="8742722E"/>
+    <w:styleLink w:val="CurrentList1"/>
+    <w:lvl w:ilvl="0">
+      <w:start w:val="1"/>
+      <w:numFmt w:val="decimal"/>
+      <w:lvlText w:val="%1."/>
+      <w:lvlJc w:val="left"/>
+      <w:pPr>
+        <w:ind w:left="720" w:hanging="360"/>
+      </w:pPr>
+      <w:rPr>
+        <w:rFonts w:ascii="Arial" w:eastAsia="Arial" w:hAnsi="Arial" w:cs="Arial"/>
+      </w:rPr>
+    </w:lvl>
+    <w:lvl w:ilvl="1">
+      <w:start w:val="1"/>
+      <w:numFmt w:val="decimal"/>
+      <w:isLgl/>
+      <w:lvlText w:val="%1.%2"/>
+      <w:lvlJc w:val="left"/>
+      <w:pPr>
+        <w:ind w:left="720" w:hanging="360"/>
+      </w:pPr>
+      <w:rPr>
+        <w:rFonts w:hint="default"/>
+      </w:rPr>
+    </w:lvl>
+    <w:lvl w:ilvl="2">
+      <w:start w:val="1"/>
+      <w:numFmt w:val="decimal"/>
+      <w:isLgl/>
+      <w:lvlText w:val="%1.%2.%3"/>
+      <w:lvlJc w:val="left"/>
+      <w:pPr>
+        <w:ind w:left="1080" w:hanging="720"/>
+      </w:pPr>
+      <w:rPr>
+        <w:rFonts w:hint="default"/>
+      </w:rPr>
+    </w:lvl>
+    <w:lvl w:ilvl="3">
+      <w:start w:val="1"/>
+      <w:numFmt w:val="decimal"/>
+      <w:isLgl/>
+      <w:lvlText w:val="%1.%2.%3.%4"/>
+      <w:lvlJc w:val="left"/>
+      <w:pPr>
+        <w:ind w:left="1440" w:hanging="1080"/>
+      </w:pPr>
+      <w:rPr>
+        <w:rFonts w:hint="default"/>
+      </w:rPr>
+    </w:lvl>
+    <w:lvl w:ilvl="4">
+      <w:start w:val="1"/>
+      <w:numFmt w:val="decimal"/>
+      <w:isLgl/>
+      <w:lvlText w:val="%1.%2.%3.%4.%5"/>
+      <w:lvlJc w:val="left"/>
+      <w:pPr>
+        <w:ind w:left="1440" w:hanging="1080"/>
+      </w:pPr>
+      <w:rPr>
+        <w:rFonts w:hint="default"/>
+      </w:rPr>
+    </w:lvl>
+    <w:lvl w:ilvl="5">
+      <w:start w:val="1"/>
+      <w:numFmt w:val="decimal"/>
+      <w:isLgl/>
+      <w:lvlText w:val="%1.%2.%3.%4.%5.%6"/>
+      <w:lvlJc w:val="left"/>
+      <w:pPr>
+        <w:ind w:left="1800" w:hanging="1440"/>
+      </w:pPr>
+      <w:rPr>
+        <w:rFonts w:hint="default"/>
+      </w:rPr>
+    </w:lvl>
+    <w:lvl w:ilvl="6">
+      <w:start w:val="1"/>
+      <w:numFmt w:val="decimal"/>
+      <w:isLgl/>
+      <w:lvlText w:val="%1.%2.%3.%4.%5.%6.%7"/>
+      <w:lvlJc w:val="left"/>
+      <w:pPr>
+        <w:ind w:left="1800" w:hanging="1440"/>
+      </w:pPr>
+      <w:rPr>
+        <w:rFonts w:hint="default"/>
+      </w:rPr>
+    </w:lvl>
+    <w:lvl w:ilvl="7">
+      <w:start w:val="1"/>
+      <w:numFmt w:val="decimal"/>
+      <w:isLgl/>
+      <w:lvlText w:val="%1.%2.%3.%4.%5.%6.%7.%8"/>
+      <w:lvlJc w:val="left"/>
+      <w:pPr>
+        <w:ind w:left="2160" w:hanging="1800"/>
+      </w:pPr>
+      <w:rPr>
+        <w:rFonts w:hint="default"/>
+      </w:rPr>
+    </w:lvl>
+    <w:lvl w:ilvl="8">
+      <w:start w:val="1"/>
+      <w:numFmt w:val="decimal"/>
+      <w:isLgl/>
+      <w:lvlText w:val="%1.%2.%3.%4.%5.%6.%7.%8.%9"/>
+      <w:lvlJc w:val="left"/>
+      <w:pPr>
+        <w:ind w:left="2160" w:hanging="1800"/>
+      </w:pPr>
+      <w:rPr>
+        <w:rFonts w:hint="default"/>
+      </w:rPr>
+    </w:lvl>
+  </w:abstractNum>
+  <w:abstractNum w:abstractNumId="4" w15:restartNumberingAfterBreak="0">
     <w:nsid w:val="459C31EE"/>
     <w:multiLevelType w:val="multilevel"/>
     <w:tmpl w:val="549EC5F6"/>
@@ -2762,7 +3548,7 @@
       </w:pPr>
     </w:lvl>
   </w:abstractNum>
-  <w:abstractNum w:abstractNumId="2" w15:restartNumberingAfterBreak="0">
+  <w:abstractNum w:abstractNumId="5" w15:restartNumberingAfterBreak="0">
     <w:nsid w:val="5E6D527B"/>
     <w:multiLevelType w:val="hybridMultilevel"/>
     <w:tmpl w:val="8CC86EC4"/>
@@ -2852,14 +3638,367 @@
       </w:pPr>
     </w:lvl>
   </w:abstractNum>
+  <w:abstractNum w:abstractNumId="6" w15:restartNumberingAfterBreak="0">
+    <w:nsid w:val="6DF100AC"/>
+    <w:multiLevelType w:val="multilevel"/>
+    <w:tmpl w:val="9CE0ED4E"/>
+    <w:styleLink w:val="CurrentList3"/>
+    <w:lvl w:ilvl="0">
+      <w:start w:val="1"/>
+      <w:numFmt w:val="decimal"/>
+      <w:lvlText w:val="%1."/>
+      <w:lvlJc w:val="left"/>
+      <w:pPr>
+        <w:ind w:left="0" w:firstLine="360"/>
+      </w:pPr>
+      <w:rPr>
+        <w:rFonts w:ascii="Arial" w:eastAsia="Arial" w:hAnsi="Arial" w:cs="Arial"/>
+      </w:rPr>
+    </w:lvl>
+    <w:lvl w:ilvl="1">
+      <w:start w:val="1"/>
+      <w:numFmt w:val="decimal"/>
+      <w:isLgl/>
+      <w:lvlText w:val="%1.%2"/>
+      <w:lvlJc w:val="left"/>
+      <w:pPr>
+        <w:ind w:left="737" w:hanging="737"/>
+      </w:pPr>
+      <w:rPr>
+        <w:rFonts w:hint="default"/>
+      </w:rPr>
+    </w:lvl>
+    <w:lvl w:ilvl="2">
+      <w:start w:val="1"/>
+      <w:numFmt w:val="decimal"/>
+      <w:isLgl/>
+      <w:lvlText w:val="%1.%2.%3"/>
+      <w:lvlJc w:val="left"/>
+      <w:pPr>
+        <w:ind w:left="1080" w:hanging="720"/>
+      </w:pPr>
+      <w:rPr>
+        <w:rFonts w:hint="default"/>
+      </w:rPr>
+    </w:lvl>
+    <w:lvl w:ilvl="3">
+      <w:start w:val="1"/>
+      <w:numFmt w:val="decimal"/>
+      <w:isLgl/>
+      <w:lvlText w:val="%1.%2.%3.%4"/>
+      <w:lvlJc w:val="left"/>
+      <w:pPr>
+        <w:ind w:left="1440" w:hanging="1080"/>
+      </w:pPr>
+      <w:rPr>
+        <w:rFonts w:hint="default"/>
+      </w:rPr>
+    </w:lvl>
+    <w:lvl w:ilvl="4">
+      <w:start w:val="1"/>
+      <w:numFmt w:val="decimal"/>
+      <w:isLgl/>
+      <w:lvlText w:val="%1.%2.%3.%4.%5"/>
+      <w:lvlJc w:val="left"/>
+      <w:pPr>
+        <w:ind w:left="1440" w:hanging="1080"/>
+      </w:pPr>
+      <w:rPr>
+        <w:rFonts w:hint="default"/>
+      </w:rPr>
+    </w:lvl>
+    <w:lvl w:ilvl="5">
+      <w:start w:val="1"/>
+      <w:numFmt w:val="decimal"/>
+      <w:isLgl/>
+      <w:lvlText w:val="%1.%2.%3.%4.%5.%6"/>
+      <w:lvlJc w:val="left"/>
+      <w:pPr>
+        <w:ind w:left="1800" w:hanging="1440"/>
+      </w:pPr>
+      <w:rPr>
+        <w:rFonts w:hint="default"/>
+      </w:rPr>
+    </w:lvl>
+    <w:lvl w:ilvl="6">
+      <w:start w:val="1"/>
+      <w:numFmt w:val="decimal"/>
+      <w:isLgl/>
+      <w:lvlText w:val="%1.%2.%3.%4.%5.%6.%7"/>
+      <w:lvlJc w:val="left"/>
+      <w:pPr>
+        <w:ind w:left="1800" w:hanging="1440"/>
+      </w:pPr>
+      <w:rPr>
+        <w:rFonts w:hint="default"/>
+      </w:rPr>
+    </w:lvl>
+    <w:lvl w:ilvl="7">
+      <w:start w:val="1"/>
+      <w:numFmt w:val="decimal"/>
+      <w:isLgl/>
+      <w:lvlText w:val="%1.%2.%3.%4.%5.%6.%7.%8"/>
+      <w:lvlJc w:val="left"/>
+      <w:pPr>
+        <w:ind w:left="2160" w:hanging="1800"/>
+      </w:pPr>
+      <w:rPr>
+        <w:rFonts w:hint="default"/>
+      </w:rPr>
+    </w:lvl>
+    <w:lvl w:ilvl="8">
+      <w:start w:val="1"/>
+      <w:numFmt w:val="decimal"/>
+      <w:isLgl/>
+      <w:lvlText w:val="%1.%2.%3.%4.%5.%6.%7.%8.%9"/>
+      <w:lvlJc w:val="left"/>
+      <w:pPr>
+        <w:ind w:left="2160" w:hanging="1800"/>
+      </w:pPr>
+      <w:rPr>
+        <w:rFonts w:hint="default"/>
+      </w:rPr>
+    </w:lvl>
+  </w:abstractNum>
+  <w:abstractNum w:abstractNumId="7" w15:restartNumberingAfterBreak="0">
+    <w:nsid w:val="725627A8"/>
+    <w:multiLevelType w:val="multilevel"/>
+    <w:tmpl w:val="E5C8DD72"/>
+    <w:styleLink w:val="CurrentList2"/>
+    <w:lvl w:ilvl="0">
+      <w:start w:val="1"/>
+      <w:numFmt w:val="decimal"/>
+      <w:lvlText w:val="%1."/>
+      <w:lvlJc w:val="left"/>
+      <w:pPr>
+        <w:ind w:left="0" w:firstLine="360"/>
+      </w:pPr>
+      <w:rPr>
+        <w:rFonts w:ascii="Arial" w:eastAsia="Arial" w:hAnsi="Arial" w:cs="Arial"/>
+      </w:rPr>
+    </w:lvl>
+    <w:lvl w:ilvl="1">
+      <w:start w:val="1"/>
+      <w:numFmt w:val="decimal"/>
+      <w:isLgl/>
+      <w:lvlText w:val="%1.%2"/>
+      <w:lvlJc w:val="left"/>
+      <w:pPr>
+        <w:ind w:left="720" w:hanging="360"/>
+      </w:pPr>
+      <w:rPr>
+        <w:rFonts w:hint="default"/>
+      </w:rPr>
+    </w:lvl>
+    <w:lvl w:ilvl="2">
+      <w:start w:val="1"/>
+      <w:numFmt w:val="decimal"/>
+      <w:isLgl/>
+      <w:lvlText w:val="%1.%2.%3"/>
+      <w:lvlJc w:val="left"/>
+      <w:pPr>
+        <w:ind w:left="1080" w:hanging="720"/>
+      </w:pPr>
+      <w:rPr>
+        <w:rFonts w:hint="default"/>
+      </w:rPr>
+    </w:lvl>
+    <w:lvl w:ilvl="3">
+      <w:start w:val="1"/>
+      <w:numFmt w:val="decimal"/>
+      <w:isLgl/>
+      <w:lvlText w:val="%1.%2.%3.%4"/>
+      <w:lvlJc w:val="left"/>
+      <w:pPr>
+        <w:ind w:left="1440" w:hanging="1080"/>
+      </w:pPr>
+      <w:rPr>
+        <w:rFonts w:hint="default"/>
+      </w:rPr>
+    </w:lvl>
+    <w:lvl w:ilvl="4">
+      <w:start w:val="1"/>
+      <w:numFmt w:val="decimal"/>
+      <w:isLgl/>
+      <w:lvlText w:val="%1.%2.%3.%4.%5"/>
+      <w:lvlJc w:val="left"/>
+      <w:pPr>
+        <w:ind w:left="1440" w:hanging="1080"/>
+      </w:pPr>
+      <w:rPr>
+        <w:rFonts w:hint="default"/>
+      </w:rPr>
+    </w:lvl>
+    <w:lvl w:ilvl="5">
+      <w:start w:val="1"/>
+      <w:numFmt w:val="decimal"/>
+      <w:isLgl/>
+      <w:lvlText w:val="%1.%2.%3.%4.%5.%6"/>
+      <w:lvlJc w:val="left"/>
+      <w:pPr>
+        <w:ind w:left="1800" w:hanging="1440"/>
+      </w:pPr>
+      <w:rPr>
+        <w:rFonts w:hint="default"/>
+      </w:rPr>
+    </w:lvl>
+    <w:lvl w:ilvl="6">
+      <w:start w:val="1"/>
+      <w:numFmt w:val="decimal"/>
+      <w:isLgl/>
+      <w:lvlText w:val="%1.%2.%3.%4.%5.%6.%7"/>
+      <w:lvlJc w:val="left"/>
+      <w:pPr>
+        <w:ind w:left="1800" w:hanging="1440"/>
+      </w:pPr>
+      <w:rPr>
+        <w:rFonts w:hint="default"/>
+      </w:rPr>
+    </w:lvl>
+    <w:lvl w:ilvl="7">
+      <w:start w:val="1"/>
+      <w:numFmt w:val="decimal"/>
+      <w:isLgl/>
+      <w:lvlText w:val="%1.%2.%3.%4.%5.%6.%7.%8"/>
+      <w:lvlJc w:val="left"/>
+      <w:pPr>
+        <w:ind w:left="2160" w:hanging="1800"/>
+      </w:pPr>
+      <w:rPr>
+        <w:rFonts w:hint="default"/>
+      </w:rPr>
+    </w:lvl>
+    <w:lvl w:ilvl="8">
+      <w:start w:val="1"/>
+      <w:numFmt w:val="decimal"/>
+      <w:isLgl/>
+      <w:lvlText w:val="%1.%2.%3.%4.%5.%6.%7.%8.%9"/>
+      <w:lvlJc w:val="left"/>
+      <w:pPr>
+        <w:ind w:left="2160" w:hanging="1800"/>
+      </w:pPr>
+      <w:rPr>
+        <w:rFonts w:hint="default"/>
+      </w:rPr>
+    </w:lvl>
+  </w:abstractNum>
+  <w:abstractNum w:abstractNumId="8" w15:restartNumberingAfterBreak="0">
+    <w:nsid w:val="7D701640"/>
+    <w:multiLevelType w:val="hybridMultilevel"/>
+    <w:tmpl w:val="05E2FAB2"/>
+    <w:lvl w:ilvl="0" w:tplc="0D6EA720">
+      <w:start w:val="13"/>
+      <w:numFmt w:val="decimal"/>
+      <w:lvlText w:val="%1"/>
+      <w:lvlJc w:val="left"/>
+      <w:pPr>
+        <w:ind w:left="720" w:hanging="360"/>
+      </w:pPr>
+      <w:rPr>
+        <w:rFonts w:hint="default"/>
+        <w:color w:val="0000FF" w:themeColor="hyperlink"/>
+        <w:u w:val="single"/>
+      </w:rPr>
+    </w:lvl>
+    <w:lvl w:ilvl="1" w:tplc="04090019" w:tentative="1">
+      <w:start w:val="1"/>
+      <w:numFmt w:val="lowerLetter"/>
+      <w:lvlText w:val="%2."/>
+      <w:lvlJc w:val="left"/>
+      <w:pPr>
+        <w:ind w:left="1440" w:hanging="360"/>
+      </w:pPr>
+    </w:lvl>
+    <w:lvl w:ilvl="2" w:tplc="0409001B" w:tentative="1">
+      <w:start w:val="1"/>
+      <w:numFmt w:val="lowerRoman"/>
+      <w:lvlText w:val="%3."/>
+      <w:lvlJc w:val="right"/>
+      <w:pPr>
+        <w:ind w:left="2160" w:hanging="180"/>
+      </w:pPr>
+    </w:lvl>
+    <w:lvl w:ilvl="3" w:tplc="0409000F" w:tentative="1">
+      <w:start w:val="1"/>
+      <w:numFmt w:val="decimal"/>
+      <w:lvlText w:val="%4."/>
+      <w:lvlJc w:val="left"/>
+      <w:pPr>
+        <w:ind w:left="2880" w:hanging="360"/>
+      </w:pPr>
+    </w:lvl>
+    <w:lvl w:ilvl="4" w:tplc="04090019" w:tentative="1">
+      <w:start w:val="1"/>
+      <w:numFmt w:val="lowerLetter"/>
+      <w:lvlText w:val="%5."/>
+      <w:lvlJc w:val="left"/>
+      <w:pPr>
+        <w:ind w:left="3600" w:hanging="360"/>
+      </w:pPr>
+    </w:lvl>
+    <w:lvl w:ilvl="5" w:tplc="0409001B" w:tentative="1">
+      <w:start w:val="1"/>
+      <w:numFmt w:val="lowerRoman"/>
+      <w:lvlText w:val="%6."/>
+      <w:lvlJc w:val="right"/>
+      <w:pPr>
+        <w:ind w:left="4320" w:hanging="180"/>
+      </w:pPr>
+    </w:lvl>
+    <w:lvl w:ilvl="6" w:tplc="0409000F" w:tentative="1">
+      <w:start w:val="1"/>
+      <w:numFmt w:val="decimal"/>
+      <w:lvlText w:val="%7."/>
+      <w:lvlJc w:val="left"/>
+      <w:pPr>
+        <w:ind w:left="5040" w:hanging="360"/>
+      </w:pPr>
+    </w:lvl>
+    <w:lvl w:ilvl="7" w:tplc="04090019" w:tentative="1">
+      <w:start w:val="1"/>
+      <w:numFmt w:val="lowerLetter"/>
+      <w:lvlText w:val="%8."/>
+      <w:lvlJc w:val="left"/>
+      <w:pPr>
+        <w:ind w:left="5760" w:hanging="360"/>
+      </w:pPr>
+    </w:lvl>
+    <w:lvl w:ilvl="8" w:tplc="0409001B" w:tentative="1">
+      <w:start w:val="1"/>
+      <w:numFmt w:val="lowerRoman"/>
+      <w:lvlText w:val="%9."/>
+      <w:lvlJc w:val="right"/>
+      <w:pPr>
+        <w:ind w:left="6480" w:hanging="180"/>
+      </w:pPr>
+    </w:lvl>
+  </w:abstractNum>
   <w:num w:numId="1" w16cid:durableId="857430568">
     <w:abstractNumId w:val="0"/>
   </w:num>
   <w:num w:numId="2" w16cid:durableId="748113075">
+    <w:abstractNumId w:val="5"/>
+  </w:num>
+  <w:num w:numId="3" w16cid:durableId="897016709">
+    <w:abstractNumId w:val="4"/>
+  </w:num>
+  <w:num w:numId="4" w16cid:durableId="477649083">
+    <w:abstractNumId w:val="1"/>
+  </w:num>
+  <w:num w:numId="5" w16cid:durableId="1404522404">
+    <w:abstractNumId w:val="8"/>
+  </w:num>
+  <w:num w:numId="6" w16cid:durableId="58285120">
+    <w:abstractNumId w:val="3"/>
+  </w:num>
+  <w:num w:numId="7" w16cid:durableId="2007123800">
     <w:abstractNumId w:val="2"/>
   </w:num>
-  <w:num w:numId="3" w16cid:durableId="897016709">
-    <w:abstractNumId w:val="1"/>
+  <w:num w:numId="8" w16cid:durableId="173495036">
+    <w:abstractNumId w:val="7"/>
+  </w:num>
+  <w:num w:numId="9" w16cid:durableId="1918590049">
+    <w:abstractNumId w:val="6"/>
   </w:num>
 </w:numbering>
 </file>
@@ -3267,8 +4406,10 @@
     <w:name w:val="heading 1"/>
     <w:basedOn w:val="Normal"/>
     <w:next w:val="Normal"/>
+    <w:link w:val="Heading1Char"/>
     <w:uiPriority w:val="9"/>
     <w:qFormat/>
+    <w:rsid w:val="00E91C12"/>
     <w:pPr>
       <w:keepNext/>
       <w:keepLines/>
@@ -3279,7 +4420,7 @@
     <w:rPr>
       <w:b/>
       <w:color w:val="000000"/>
-      <w:sz w:val="28"/>
+      <w:sz w:val="32"/>
       <w:szCs w:val="28"/>
     </w:rPr>
   </w:style>
@@ -3287,9 +4428,11 @@
     <w:name w:val="heading 2"/>
     <w:basedOn w:val="Normal"/>
     <w:next w:val="Normal"/>
+    <w:link w:val="Heading2Char"/>
     <w:uiPriority w:val="9"/>
     <w:unhideWhenUsed/>
     <w:qFormat/>
+    <w:rsid w:val="001A6449"/>
     <w:pPr>
       <w:keepNext/>
       <w:keepLines/>
@@ -3300,6 +4443,7 @@
     <w:rPr>
       <w:b/>
       <w:color w:val="000000"/>
+      <w:sz w:val="28"/>
     </w:rPr>
   </w:style>
   <w:style w:type="paragraph" w:styleId="Heading3">
@@ -3515,8 +4659,15 @@
     <w:unhideWhenUsed/>
     <w:rsid w:val="00001597"/>
     <w:pPr>
-      <w:spacing w:after="100"/>
+      <w:spacing w:before="120" w:after="0"/>
     </w:pPr>
+    <w:rPr>
+      <w:rFonts w:asciiTheme="minorHAnsi" w:hAnsiTheme="minorHAnsi"/>
+      <w:b/>
+      <w:bCs/>
+      <w:i/>
+      <w:iCs/>
+    </w:rPr>
   </w:style>
   <w:style w:type="paragraph" w:styleId="TOC2">
     <w:name w:val="toc 2"/>
@@ -3527,9 +4678,16 @@
     <w:unhideWhenUsed/>
     <w:rsid w:val="00001597"/>
     <w:pPr>
-      <w:spacing w:after="100"/>
+      <w:spacing w:before="120" w:after="0"/>
       <w:ind w:left="240"/>
     </w:pPr>
+    <w:rPr>
+      <w:rFonts w:asciiTheme="minorHAnsi" w:hAnsiTheme="minorHAnsi"/>
+      <w:b/>
+      <w:bCs/>
+      <w:sz w:val="22"/>
+      <w:szCs w:val="22"/>
+    </w:rPr>
   </w:style>
   <w:style w:type="character" w:styleId="Hyperlink">
     <w:name w:val="Hyperlink"/>
@@ -3540,6 +4698,215 @@
     <w:rPr>
       <w:color w:val="0000FF" w:themeColor="hyperlink"/>
       <w:u w:val="single"/>
+    </w:rPr>
+  </w:style>
+  <w:style w:type="numbering" w:customStyle="1" w:styleId="CurrentList1">
+    <w:name w:val="Current List1"/>
+    <w:uiPriority w:val="99"/>
+    <w:rsid w:val="008C4A2B"/>
+    <w:pPr>
+      <w:numPr>
+        <w:numId w:val="6"/>
+      </w:numPr>
+    </w:pPr>
+  </w:style>
+  <w:style w:type="numbering" w:customStyle="1" w:styleId="CurrentList2">
+    <w:name w:val="Current List2"/>
+    <w:uiPriority w:val="99"/>
+    <w:rsid w:val="00DD6A01"/>
+    <w:pPr>
+      <w:numPr>
+        <w:numId w:val="8"/>
+      </w:numPr>
+    </w:pPr>
+  </w:style>
+  <w:style w:type="numbering" w:customStyle="1" w:styleId="CurrentList3">
+    <w:name w:val="Current List3"/>
+    <w:uiPriority w:val="99"/>
+    <w:rsid w:val="00DD6A01"/>
+    <w:pPr>
+      <w:numPr>
+        <w:numId w:val="9"/>
+      </w:numPr>
+    </w:pPr>
+  </w:style>
+  <w:style w:type="character" w:customStyle="1" w:styleId="Heading2Char">
+    <w:name w:val="Heading 2 Char"/>
+    <w:basedOn w:val="DefaultParagraphFont"/>
+    <w:link w:val="Heading2"/>
+    <w:uiPriority w:val="9"/>
+    <w:rsid w:val="00E91C12"/>
+    <w:rPr>
+      <w:b/>
+      <w:color w:val="000000"/>
+      <w:sz w:val="28"/>
+    </w:rPr>
+  </w:style>
+  <w:style w:type="character" w:customStyle="1" w:styleId="Heading1Char">
+    <w:name w:val="Heading 1 Char"/>
+    <w:basedOn w:val="DefaultParagraphFont"/>
+    <w:link w:val="Heading1"/>
+    <w:uiPriority w:val="9"/>
+    <w:rsid w:val="00E91C12"/>
+    <w:rPr>
+      <w:b/>
+      <w:color w:val="000000"/>
+      <w:sz w:val="32"/>
+      <w:szCs w:val="28"/>
+    </w:rPr>
+  </w:style>
+  <w:style w:type="paragraph" w:styleId="TOCHeading">
+    <w:name w:val="TOC Heading"/>
+    <w:basedOn w:val="Heading1"/>
+    <w:next w:val="Normal"/>
+    <w:uiPriority w:val="39"/>
+    <w:unhideWhenUsed/>
+    <w:qFormat/>
+    <w:rsid w:val="00D273DD"/>
+    <w:pPr>
+      <w:spacing w:before="480" w:line="276" w:lineRule="auto"/>
+      <w:ind w:left="0" w:firstLine="0"/>
+      <w:outlineLvl w:val="9"/>
+    </w:pPr>
+    <w:rPr>
+      <w:rFonts w:asciiTheme="majorHAnsi" w:eastAsiaTheme="majorEastAsia" w:hAnsiTheme="majorHAnsi" w:cstheme="majorBidi"/>
+      <w:bCs/>
+      <w:color w:val="365F91" w:themeColor="accent1" w:themeShade="BF"/>
+      <w:sz w:val="28"/>
+      <w:lang w:val="en-US"/>
+    </w:rPr>
+  </w:style>
+  <w:style w:type="paragraph" w:styleId="TOC3">
+    <w:name w:val="toc 3"/>
+    <w:basedOn w:val="Normal"/>
+    <w:next w:val="Normal"/>
+    <w:autoRedefine/>
+    <w:uiPriority w:val="39"/>
+    <w:semiHidden/>
+    <w:unhideWhenUsed/>
+    <w:rsid w:val="00D273DD"/>
+    <w:pPr>
+      <w:spacing w:after="0"/>
+      <w:ind w:left="480"/>
+    </w:pPr>
+    <w:rPr>
+      <w:rFonts w:asciiTheme="minorHAnsi" w:hAnsiTheme="minorHAnsi"/>
+      <w:sz w:val="20"/>
+      <w:szCs w:val="20"/>
+    </w:rPr>
+  </w:style>
+  <w:style w:type="paragraph" w:styleId="TOC4">
+    <w:name w:val="toc 4"/>
+    <w:basedOn w:val="Normal"/>
+    <w:next w:val="Normal"/>
+    <w:autoRedefine/>
+    <w:uiPriority w:val="39"/>
+    <w:semiHidden/>
+    <w:unhideWhenUsed/>
+    <w:rsid w:val="00D273DD"/>
+    <w:pPr>
+      <w:spacing w:after="0"/>
+      <w:ind w:left="720"/>
+    </w:pPr>
+    <w:rPr>
+      <w:rFonts w:asciiTheme="minorHAnsi" w:hAnsiTheme="minorHAnsi"/>
+      <w:sz w:val="20"/>
+      <w:szCs w:val="20"/>
+    </w:rPr>
+  </w:style>
+  <w:style w:type="paragraph" w:styleId="TOC5">
+    <w:name w:val="toc 5"/>
+    <w:basedOn w:val="Normal"/>
+    <w:next w:val="Normal"/>
+    <w:autoRedefine/>
+    <w:uiPriority w:val="39"/>
+    <w:semiHidden/>
+    <w:unhideWhenUsed/>
+    <w:rsid w:val="00D273DD"/>
+    <w:pPr>
+      <w:spacing w:after="0"/>
+      <w:ind w:left="960"/>
+    </w:pPr>
+    <w:rPr>
+      <w:rFonts w:asciiTheme="minorHAnsi" w:hAnsiTheme="minorHAnsi"/>
+      <w:sz w:val="20"/>
+      <w:szCs w:val="20"/>
+    </w:rPr>
+  </w:style>
+  <w:style w:type="paragraph" w:styleId="TOC6">
+    <w:name w:val="toc 6"/>
+    <w:basedOn w:val="Normal"/>
+    <w:next w:val="Normal"/>
+    <w:autoRedefine/>
+    <w:uiPriority w:val="39"/>
+    <w:semiHidden/>
+    <w:unhideWhenUsed/>
+    <w:rsid w:val="00D273DD"/>
+    <w:pPr>
+      <w:spacing w:after="0"/>
+      <w:ind w:left="1200"/>
+    </w:pPr>
+    <w:rPr>
+      <w:rFonts w:asciiTheme="minorHAnsi" w:hAnsiTheme="minorHAnsi"/>
+      <w:sz w:val="20"/>
+      <w:szCs w:val="20"/>
+    </w:rPr>
+  </w:style>
+  <w:style w:type="paragraph" w:styleId="TOC7">
+    <w:name w:val="toc 7"/>
+    <w:basedOn w:val="Normal"/>
+    <w:next w:val="Normal"/>
+    <w:autoRedefine/>
+    <w:uiPriority w:val="39"/>
+    <w:semiHidden/>
+    <w:unhideWhenUsed/>
+    <w:rsid w:val="00D273DD"/>
+    <w:pPr>
+      <w:spacing w:after="0"/>
+      <w:ind w:left="1440"/>
+    </w:pPr>
+    <w:rPr>
+      <w:rFonts w:asciiTheme="minorHAnsi" w:hAnsiTheme="minorHAnsi"/>
+      <w:sz w:val="20"/>
+      <w:szCs w:val="20"/>
+    </w:rPr>
+  </w:style>
+  <w:style w:type="paragraph" w:styleId="TOC8">
+    <w:name w:val="toc 8"/>
+    <w:basedOn w:val="Normal"/>
+    <w:next w:val="Normal"/>
+    <w:autoRedefine/>
+    <w:uiPriority w:val="39"/>
+    <w:semiHidden/>
+    <w:unhideWhenUsed/>
+    <w:rsid w:val="00D273DD"/>
+    <w:pPr>
+      <w:spacing w:after="0"/>
+      <w:ind w:left="1680"/>
+    </w:pPr>
+    <w:rPr>
+      <w:rFonts w:asciiTheme="minorHAnsi" w:hAnsiTheme="minorHAnsi"/>
+      <w:sz w:val="20"/>
+      <w:szCs w:val="20"/>
+    </w:rPr>
+  </w:style>
+  <w:style w:type="paragraph" w:styleId="TOC9">
+    <w:name w:val="toc 9"/>
+    <w:basedOn w:val="Normal"/>
+    <w:next w:val="Normal"/>
+    <w:autoRedefine/>
+    <w:uiPriority w:val="39"/>
+    <w:semiHidden/>
+    <w:unhideWhenUsed/>
+    <w:rsid w:val="00D273DD"/>
+    <w:pPr>
+      <w:spacing w:after="0"/>
+      <w:ind w:left="1920"/>
+    </w:pPr>
+    <w:rPr>
+      <w:rFonts w:asciiTheme="minorHAnsi" w:hAnsiTheme="minorHAnsi"/>
+      <w:sz w:val="20"/>
+      <w:szCs w:val="20"/>
     </w:rPr>
   </w:style>
 </w:styles>
@@ -3640,6 +5007,13 @@
     <w:pitch w:val="variable"/>
     <w:sig w:usb0="00000287" w:usb1="00000000" w:usb2="00000000" w:usb3="00000000" w:csb0="0000009F" w:csb1="00000000"/>
   </w:font>
+  <w:font w:name="Cambria">
+    <w:panose1 w:val="02040503050406030204"/>
+    <w:charset w:val="00"/>
+    <w:family w:val="roman"/>
+    <w:pitch w:val="variable"/>
+    <w:sig w:usb0="E00002FF" w:usb1="400004FF" w:usb2="00000000" w:usb3="00000000" w:csb0="0000019F" w:csb1="00000000"/>
+  </w:font>
   <w:font w:name="Times">
     <w:altName w:val="Times New Roman"/>
     <w:panose1 w:val="020B0604020202020204"/>
@@ -3647,13 +5021,6 @@
     <w:family w:val="roman"/>
     <w:pitch w:val="variable"/>
     <w:sig w:usb0="E0002EFF" w:usb1="C000785B" w:usb2="00000009" w:usb3="00000000" w:csb0="000001FF" w:csb1="00000000"/>
-  </w:font>
-  <w:font w:name="Cambria">
-    <w:panose1 w:val="02040503050406030204"/>
-    <w:charset w:val="00"/>
-    <w:family w:val="roman"/>
-    <w:pitch w:val="variable"/>
-    <w:sig w:usb0="E00002FF" w:usb1="400004FF" w:usb2="00000000" w:usb3="00000000" w:csb0="0000019F" w:csb1="00000000"/>
   </w:font>
   <w:font w:name="Aptos">
     <w:panose1 w:val="020B0004020202020204"/>
@@ -3691,6 +5058,9 @@
     <w:rsid w:val="001F3098"/>
     <w:rsid w:val="00702B33"/>
     <w:rsid w:val="0088560E"/>
+    <w:rsid w:val="00BE5997"/>
+    <w:rsid w:val="00D46BDC"/>
+    <w:rsid w:val="00F807B2"/>
   </w:rsids>
   <m:mathPr>
     <m:mathFont m:val="Cambria Math"/>
@@ -4151,46 +5521,6 @@
       <w:color w:val="808080"/>
     </w:rPr>
   </w:style>
-  <w:style w:type="paragraph" w:customStyle="1" w:styleId="FDBDB4BFBB4FB14F83DE4E588E7D7443">
-    <w:name w:val="FDBDB4BFBB4FB14F83DE4E588E7D7443"/>
-    <w:rsid w:val="001F3098"/>
-  </w:style>
-  <w:style w:type="paragraph" w:customStyle="1" w:styleId="0E44B717FC7D5B48AD307598E989ED86">
-    <w:name w:val="0E44B717FC7D5B48AD307598E989ED86"/>
-    <w:rsid w:val="001F3098"/>
-  </w:style>
-  <w:style w:type="paragraph" w:customStyle="1" w:styleId="EE099A19CC9A6C48BEC1BB6E7C84B21B">
-    <w:name w:val="EE099A19CC9A6C48BEC1BB6E7C84B21B"/>
-    <w:rsid w:val="001F3098"/>
-  </w:style>
-  <w:style w:type="paragraph" w:customStyle="1" w:styleId="7C3D001AEB7FB44093290C3B18AD6ABF">
-    <w:name w:val="7C3D001AEB7FB44093290C3B18AD6ABF"/>
-    <w:rsid w:val="001F3098"/>
-  </w:style>
-  <w:style w:type="paragraph" w:customStyle="1" w:styleId="B6B70D6B28038242BE84792778B315F2">
-    <w:name w:val="B6B70D6B28038242BE84792778B315F2"/>
-    <w:rsid w:val="001F3098"/>
-  </w:style>
-  <w:style w:type="paragraph" w:customStyle="1" w:styleId="6E8E6496CEF1F544BD091F80CEBAA2DE">
-    <w:name w:val="6E8E6496CEF1F544BD091F80CEBAA2DE"/>
-    <w:rsid w:val="001F3098"/>
-  </w:style>
-  <w:style w:type="paragraph" w:customStyle="1" w:styleId="034E1AF7007C3C47AA65E7B74AF0AB18">
-    <w:name w:val="034E1AF7007C3C47AA65E7B74AF0AB18"/>
-    <w:rsid w:val="001F3098"/>
-  </w:style>
-  <w:style w:type="paragraph" w:customStyle="1" w:styleId="685513DF484ACC47B9BA269E685B7C97">
-    <w:name w:val="685513DF484ACC47B9BA269E685B7C97"/>
-    <w:rsid w:val="001F3098"/>
-  </w:style>
-  <w:style w:type="paragraph" w:customStyle="1" w:styleId="734BEAA3A94C9D4B8F0F89865DDBE36A">
-    <w:name w:val="734BEAA3A94C9D4B8F0F89865DDBE36A"/>
-    <w:rsid w:val="001F3098"/>
-  </w:style>
-  <w:style w:type="paragraph" w:customStyle="1" w:styleId="19ED5F97B470754EAAB8CE4F15B9E545">
-    <w:name w:val="19ED5F97B470754EAAB8CE4F15B9E545"/>
-    <w:rsid w:val="001F3098"/>
-  </w:style>
   <w:style w:type="paragraph" w:customStyle="1" w:styleId="9AE1858449D744419FEC311107EE3A01">
     <w:name w:val="9AE1858449D744419FEC311107EE3A01"/>
     <w:rsid w:val="001F3098"/>
@@ -4527,4 +5857,16 @@
   </a:objectDefaults>
   <a:extraClrSchemeLst/>
 </a:theme>
+</file>
+
+<file path=customXml/item1.xml><?xml version="1.0" encoding="utf-8"?>
+<b:Sources xmlns:b="http://schemas.openxmlformats.org/officeDocument/2006/bibliography" xmlns="http://schemas.openxmlformats.org/officeDocument/2006/bibliography" SelectedStyle="/HarvardAnglia2008OfficeOnline.xsl" StyleName="Harvard - Anglia" Version="2008"/>
+</file>
+
+<file path=customXml/itemProps1.xml><?xml version="1.0" encoding="utf-8"?>
+<ds:datastoreItem xmlns:ds="http://schemas.openxmlformats.org/officeDocument/2006/customXml" ds:itemID="{27BBF6EA-8B46-8446-8549-87CF68748596}">
+  <ds:schemaRefs>
+    <ds:schemaRef ds:uri="http://schemas.openxmlformats.org/officeDocument/2006/bibliography"/>
+  </ds:schemaRefs>
+</ds:datastoreItem>
 </file>
</xml_diff>